<commit_message>
vault backup: 2026-04-20 23:37:44
</commit_message>
<xml_diff>
--- a/dev/10 Projects/AZT/07_output/agency/AZT — Правки к плану агентства (расширенная сверка) 2026-04-20.docx
+++ b/dev/10 Projects/AZT/07_output/agency/AZT — Правки к плану агентства (расширенная сверка) 2026-04-20.docx
@@ -1,6 +1,6 @@
 
 <file path=word/document.xml><?xml version="1.0" encoding="utf-8"?>
-<w:document xmlns:ns1="urn:schemas-microsoft-com:vml" xmlns:ns2="urn:schemas-microsoft-com:office:office" xmlns:ns3="http://schemas.openxmlformats.org/officeDocument/2006/relationships" xmlns:w="http://schemas.openxmlformats.org/wordprocessingml/2006/main">
+<w:document xmlns:w="http://schemas.openxmlformats.org/wordprocessingml/2006/main" xmlns:m="http://schemas.openxmlformats.org/officeDocument/2006/math" xmlns:r="http://schemas.openxmlformats.org/officeDocument/2006/relationships" xmlns:o="urn:schemas-microsoft-com:office:office" xmlns:v="urn:schemas-microsoft-com:vml" xmlns:w10="urn:schemas-microsoft-com:office:word" xmlns:a="http://schemas.openxmlformats.org/drawingml/2006/main" xmlns:pic="http://schemas.openxmlformats.org/drawingml/2006/picture" xmlns:wp="http://schemas.openxmlformats.org/drawingml/2006/wordprocessingDrawing">
   <w:body>
     <w:bookmarkStart w:id="49" w:name="X2e9538accabeff676d54f322b3f26dbd0e5fab8"/>
     <w:p>
@@ -107,7 +107,7 @@
     <w:p>
       <w:r>
         <w:pict>
-          <ns1:rect style="width:0;height:1.5pt" ns2:hralign="center" ns2:hrstd="t" ns2:hr="t"/>
+          <v:rect style="width:0;height:1.5pt" o:hralign="center" o:hrstd="t" o:hr="t"/>
         </w:pict>
       </w:r>
     </w:p>
@@ -2590,7 +2590,7 @@
     <w:p>
       <w:r>
         <w:pict>
-          <ns1:rect style="width:0;height:1.5pt" ns2:hralign="center" ns2:hrstd="t" ns2:hr="t"/>
+          <v:rect style="width:0;height:1.5pt" o:hralign="center" o:hrstd="t" o:hr="t"/>
         </w:pict>
       </w:r>
     </w:p>
@@ -3155,7 +3155,7 @@
     <w:p>
       <w:r>
         <w:pict>
-          <ns1:rect style="width:0;height:1.5pt" ns2:hralign="center" ns2:hrstd="t" ns2:hr="t"/>
+          <v:rect style="width:0;height:1.5pt" o:hralign="center" o:hrstd="t" o:hr="t"/>
         </w:pict>
       </w:r>
     </w:p>
@@ -3275,7 +3275,7 @@
       <w:r>
         <w:t xml:space="preserve"> </w:t>
       </w:r>
-      <w:hyperlink ns3:id="rId26">
+      <w:hyperlink r:id="rId26">
         <w:r>
           <w:rPr>
             <w:rStyle w:val="Hyperlink"/>
@@ -3289,7 +3289,7 @@
       <w:r>
         <w:t xml:space="preserve"> </w:t>
       </w:r>
-      <w:hyperlink ns3:id="rId27">
+      <w:hyperlink r:id="rId27">
         <w:r>
           <w:rPr>
             <w:rStyle w:val="Hyperlink"/>
@@ -4874,7 +4874,7 @@
     <w:p>
       <w:r>
         <w:pict>
-          <ns1:rect style="width:0;height:1.5pt" ns2:hralign="center" ns2:hrstd="t" ns2:hr="t"/>
+          <v:rect style="width:0;height:1.5pt" o:hralign="center" o:hrstd="t" o:hr="t"/>
         </w:pict>
       </w:r>
     </w:p>
@@ -6095,7 +6095,7 @@
     <w:p>
       <w:r>
         <w:pict>
-          <ns1:rect style="width:0;height:1.5pt" ns2:hralign="center" ns2:hrstd="t" ns2:hr="t"/>
+          <v:rect style="width:0;height:1.5pt" o:hralign="center" o:hrstd="t" o:hr="t"/>
         </w:pict>
       </w:r>
     </w:p>
@@ -7533,7 +7533,7 @@
     <w:p>
       <w:r>
         <w:pict>
-          <ns1:rect style="width:0;height:1.5pt" ns2:hralign="center" ns2:hrstd="t" ns2:hr="t"/>
+          <v:rect style="width:0;height:1.5pt" o:hralign="center" o:hrstd="t" o:hr="t"/>
         </w:pict>
       </w:r>
     </w:p>
@@ -7691,7 +7691,7 @@
     <w:p>
       <w:r>
         <w:pict>
-          <ns1:rect style="width:0;height:1.5pt" ns2:hralign="center" ns2:hrstd="t" ns2:hr="t"/>
+          <v:rect style="width:0;height:1.5pt" o:hralign="center" o:hrstd="t" o:hr="t"/>
         </w:pict>
       </w:r>
     </w:p>
@@ -8361,7 +8361,7 @@
     <w:p>
       <w:r>
         <w:pict>
-          <ns1:rect style="width:0;height:1.5pt" ns2:hralign="center" ns2:hrstd="t" ns2:hr="t"/>
+          <v:rect style="width:0;height:1.5pt" o:hralign="center" o:hrstd="t" o:hr="t"/>
         </w:pict>
       </w:r>
     </w:p>
@@ -8684,7 +8684,7 @@
     <w:p>
       <w:r>
         <w:pict>
-          <ns1:rect style="width:0;height:1.5pt" ns2:hralign="center" ns2:hrstd="t" ns2:hr="t"/>
+          <v:rect style="width:0;height:1.5pt" o:hralign="center" o:hrstd="t" o:hr="t"/>
         </w:pict>
       </w:r>
     </w:p>
@@ -8903,7 +8903,7 @@
     <w:p>
       <w:r>
         <w:pict>
-          <ns1:rect style="width:0;height:1.5pt" ns2:hralign="center" ns2:hrstd="t" ns2:hr="t"/>
+          <v:rect style="width:0;height:1.5pt" o:hralign="center" o:hrstd="t" o:hr="t"/>
         </w:pict>
       </w:r>
     </w:p>
@@ -8964,7 +8964,7 @@
     <w:p>
       <w:r>
         <w:pict>
-          <ns1:rect style="width:0;height:1.5pt" ns2:hralign="center" ns2:hrstd="t" ns2:hr="t"/>
+          <v:rect style="width:0;height:1.5pt" o:hralign="center" o:hrstd="t" o:hr="t"/>
         </w:pict>
       </w:r>
     </w:p>
@@ -9041,7 +9041,7 @@
     <w:p>
       <w:r>
         <w:pict>
-          <ns1:rect style="width:0;height:1.5pt" ns2:hralign="center" ns2:hrstd="t" ns2:hr="t"/>
+          <v:rect style="width:0;height:1.5pt" o:hralign="center" o:hrstd="t" o:hr="t"/>
         </w:pict>
       </w:r>
     </w:p>
@@ -9130,7 +9130,7 @@
     <w:p>
       <w:r>
         <w:pict>
-          <ns1:rect style="width:0;height:1.5pt" ns2:hralign="center" ns2:hrstd="t" ns2:hr="t"/>
+          <v:rect style="width:0;height:1.5pt" o:hralign="center" o:hrstd="t" o:hr="t"/>
         </w:pict>
       </w:r>
     </w:p>

</xml_diff>

<commit_message>
vault backup: 2026-04-20 23:52:59
</commit_message>
<xml_diff>
--- a/dev/10 Projects/AZT/07_output/agency/AZT — Правки к плану агентства (расширенная сверка) 2026-04-20.docx
+++ b/dev/10 Projects/AZT/07_output/agency/AZT — Правки к плану агентства (расширенная сверка) 2026-04-20.docx
@@ -13,7 +13,11 @@
       <w:bookmarkStart w:id="0" w:name="X2e9538accabeff676d54f322b3f26dbd0e5fab8"/>
       <w:r>
         <w:rPr/>
-        <w:t>AZT — Правки к плану агентства (финальная версия после полной сверки семядра)</w:t>
+        <w:t xml:space="preserve">AZT — </w:t>
+      </w:r>
+      <w:r>
+        <w:rPr/>
+        <w:t>Сверка семядра</w:t>
       </w:r>
     </w:p>
     <w:p>
@@ -4716,7 +4720,7 @@
         <w:pStyle w:val="Compact"/>
         <w:numPr>
           <w:ilvl w:val="0"/>
-          <w:numId w:val="22"/>
+          <w:numId w:val="23"/>
         </w:numPr>
         <w:rPr/>
       </w:pPr>
@@ -4737,7 +4741,7 @@
         <w:pStyle w:val="Compact"/>
         <w:numPr>
           <w:ilvl w:val="0"/>
-          <w:numId w:val="23"/>
+          <w:numId w:val="24"/>
         </w:numPr>
         <w:rPr/>
       </w:pPr>
@@ -4758,7 +4762,7 @@
         <w:pStyle w:val="Compact"/>
         <w:numPr>
           <w:ilvl w:val="0"/>
-          <w:numId w:val="24"/>
+          <w:numId w:val="25"/>
         </w:numPr>
         <w:rPr/>
       </w:pPr>
@@ -4779,7 +4783,7 @@
         <w:pStyle w:val="Compact"/>
         <w:numPr>
           <w:ilvl w:val="0"/>
-          <w:numId w:val="25"/>
+          <w:numId w:val="26"/>
         </w:numPr>
         <w:rPr/>
       </w:pPr>
@@ -4838,7 +4842,7 @@
         <w:pStyle w:val="Compact"/>
         <w:numPr>
           <w:ilvl w:val="0"/>
-          <w:numId w:val="26"/>
+          <w:numId w:val="27"/>
         </w:numPr>
         <w:rPr/>
       </w:pPr>
@@ -4933,7 +4937,7 @@
         <w:pStyle w:val="Compact"/>
         <w:numPr>
           <w:ilvl w:val="1"/>
-          <w:numId w:val="27"/>
+          <w:numId w:val="28"/>
         </w:numPr>
         <w:rPr/>
       </w:pPr>
@@ -4946,26 +4950,6 @@
       <w:r>
         <w:rPr/>
         <w:t xml:space="preserve"> (строки ~56–78 CSV) — нулевые фразы и обратные значения.</w:t>
-      </w:r>
-    </w:p>
-    <w:p>
-      <w:pPr>
-        <w:pStyle w:val="Compact"/>
-        <w:numPr>
-          <w:ilvl w:val="1"/>
-          <w:numId w:val="28"/>
-        </w:numPr>
-        <w:rPr/>
-      </w:pPr>
-      <w:r>
-        <w:rPr>
-          <w:rStyle w:val="VerbatimChar"/>
-        </w:rPr>
-        <w:t>прямостенные теплицы</w:t>
-      </w:r>
-      <w:r>
-        <w:rPr/>
-        <w:t xml:space="preserve"> (~168–180, 345–348) — массовое завышение «парник прямостенный» и подобных.</w:t>
       </w:r>
     </w:p>
     <w:p>
@@ -4981,11 +4965,11 @@
         <w:rPr>
           <w:rStyle w:val="VerbatimChar"/>
         </w:rPr>
-        <w:t>арочные теплицы</w:t>
-      </w:r>
-      <w:r>
-        <w:rPr/>
-        <w:t xml:space="preserve"> (~133–140, 362–363) — вопиющее завышение по «теплица каплевидная 3 на 6» (19 957 → 369).</w:t>
+        <w:t>прямостенные теплицы</w:t>
+      </w:r>
+      <w:r>
+        <w:rPr/>
+        <w:t xml:space="preserve"> (~168–180, 345–348) — массовое завышение «парник прямостенный» и подобных.</w:t>
       </w:r>
     </w:p>
     <w:p>
@@ -5001,11 +4985,11 @@
         <w:rPr>
           <w:rStyle w:val="VerbatimChar"/>
         </w:rPr>
-        <w:t>промышленные/фермерские теплицы</w:t>
-      </w:r>
-      <w:r>
-        <w:rPr/>
-        <w:t xml:space="preserve"> (~184–201) — завышения.</w:t>
+        <w:t>арочные теплицы</w:t>
+      </w:r>
+      <w:r>
+        <w:rPr/>
+        <w:t xml:space="preserve"> (~133–140, 362–363) — вопиющее завышение по «теплица каплевидная 3 на 6» (19 957 → 369).</w:t>
       </w:r>
     </w:p>
     <w:p>
@@ -5021,11 +5005,11 @@
         <w:rPr>
           <w:rStyle w:val="VerbatimChar"/>
         </w:rPr>
-        <w:t>теплицы с отоплением</w:t>
-      </w:r>
-      <w:r>
-        <w:rPr/>
-        <w:t xml:space="preserve"> (~230–239) — практически весь кластер сильно завышен.</w:t>
+        <w:t>промышленные/фермерские теплицы</w:t>
+      </w:r>
+      <w:r>
+        <w:rPr/>
+        <w:t xml:space="preserve"> (~184–201) — завышения.</w:t>
       </w:r>
     </w:p>
     <w:p>
@@ -5039,6 +5023,26 @@
       </w:pPr>
       <w:r>
         <w:rPr>
+          <w:rStyle w:val="VerbatimChar"/>
+        </w:rPr>
+        <w:t>теплицы с отоплением</w:t>
+      </w:r>
+      <w:r>
+        <w:rPr/>
+        <w:t xml:space="preserve"> (~230–239) — практически весь кластер сильно завышен.</w:t>
+      </w:r>
+    </w:p>
+    <w:p>
+      <w:pPr>
+        <w:pStyle w:val="Compact"/>
+        <w:numPr>
+          <w:ilvl w:val="1"/>
+          <w:numId w:val="33"/>
+        </w:numPr>
+        <w:rPr/>
+      </w:pPr>
+      <w:r>
+        <w:rPr>
           <w:b/>
           <w:bCs/>
         </w:rPr>
@@ -5054,7 +5058,7 @@
         <w:pStyle w:val="Compact"/>
         <w:numPr>
           <w:ilvl w:val="1"/>
-          <w:numId w:val="33"/>
+          <w:numId w:val="34"/>
         </w:numPr>
         <w:rPr/>
       </w:pPr>
@@ -6473,7 +6477,7 @@
         <w:pStyle w:val="Compact"/>
         <w:numPr>
           <w:ilvl w:val="0"/>
-          <w:numId w:val="34"/>
+          <w:numId w:val="35"/>
         </w:numPr>
         <w:rPr/>
       </w:pPr>
@@ -6493,7 +6497,7 @@
         <w:pStyle w:val="Compact"/>
         <w:numPr>
           <w:ilvl w:val="0"/>
-          <w:numId w:val="35"/>
+          <w:numId w:val="36"/>
         </w:numPr>
         <w:rPr/>
       </w:pPr>
@@ -6513,7 +6517,7 @@
         <w:pStyle w:val="Compact"/>
         <w:numPr>
           <w:ilvl w:val="0"/>
-          <w:numId w:val="36"/>
+          <w:numId w:val="37"/>
         </w:numPr>
         <w:rPr/>
       </w:pPr>
@@ -7436,7 +7440,7 @@
         <w:pStyle w:val="Compact"/>
         <w:numPr>
           <w:ilvl w:val="0"/>
-          <w:numId w:val="37"/>
+          <w:numId w:val="38"/>
         </w:numPr>
         <w:rPr/>
       </w:pPr>
@@ -7460,7 +7464,7 @@
         <w:pStyle w:val="Compact"/>
         <w:numPr>
           <w:ilvl w:val="0"/>
-          <w:numId w:val="38"/>
+          <w:numId w:val="39"/>
         </w:numPr>
         <w:rPr/>
       </w:pPr>
@@ -8392,7 +8396,7 @@
         <w:pStyle w:val="Compact"/>
         <w:numPr>
           <w:ilvl w:val="0"/>
-          <w:numId w:val="39"/>
+          <w:numId w:val="40"/>
         </w:numPr>
         <w:rPr/>
       </w:pPr>
@@ -8441,56 +8445,6 @@
           <w:rStyle w:val="VerbatimChar"/>
         </w:rPr>
         <w:t>-[ремонт телефона]</w:t>
-      </w:r>
-      <w:r>
-        <w:rPr/>
-        <w:t>.</w:t>
-      </w:r>
-    </w:p>
-    <w:p>
-      <w:pPr>
-        <w:pStyle w:val="Compact"/>
-        <w:numPr>
-          <w:ilvl w:val="0"/>
-          <w:numId w:val="40"/>
-        </w:numPr>
-        <w:rPr/>
-      </w:pPr>
-      <w:r>
-        <w:rPr>
-          <w:rStyle w:val="VerbatimChar"/>
-        </w:rPr>
-        <w:t>-мини</w:t>
-      </w:r>
-      <w:r>
-        <w:rPr/>
-        <w:t xml:space="preserve"> — при снятии возможен трафик по «мини юбка», «мини отель». Подставить </w:t>
-      </w:r>
-      <w:r>
-        <w:rPr>
-          <w:rStyle w:val="VerbatimChar"/>
-        </w:rPr>
-        <w:t>-[мини юбка]</w:t>
-      </w:r>
-      <w:r>
-        <w:rPr/>
-        <w:t xml:space="preserve">, </w:t>
-      </w:r>
-      <w:r>
-        <w:rPr>
-          <w:rStyle w:val="VerbatimChar"/>
-        </w:rPr>
-        <w:t>-[мини отель]</w:t>
-      </w:r>
-      <w:r>
-        <w:rPr/>
-        <w:t xml:space="preserve">, </w:t>
-      </w:r>
-      <w:r>
-        <w:rPr>
-          <w:rStyle w:val="VerbatimChar"/>
-        </w:rPr>
-        <w:t>-[мини бар]</w:t>
       </w:r>
       <w:r>
         <w:rPr/>
@@ -8510,21 +8464,41 @@
         <w:rPr>
           <w:rStyle w:val="VerbatimChar"/>
         </w:rPr>
-        <w:t>-отзывы</w:t>
-      </w:r>
-      <w:r>
-        <w:rPr/>
-        <w:t xml:space="preserve"> — при снятии нужно следить, чтобы реклама не крутилась по «отзывы сотрудников», «плохие отзывы» (отрицательные сентименты); добавить </w:t>
+        <w:t>-мини</w:t>
+      </w:r>
+      <w:r>
+        <w:rPr/>
+        <w:t xml:space="preserve"> — при снятии возможен трафик по «мини юбка», «мини отель». Подставить </w:t>
       </w:r>
       <w:r>
         <w:rPr>
           <w:rStyle w:val="VerbatimChar"/>
         </w:rPr>
-        <w:t>-!плохие -!негативные</w:t>
-      </w:r>
-      <w:r>
-        <w:rPr/>
-        <w:t xml:space="preserve"> как защиту.</w:t>
+        <w:t>-[мини юбка]</w:t>
+      </w:r>
+      <w:r>
+        <w:rPr/>
+        <w:t xml:space="preserve">, </w:t>
+      </w:r>
+      <w:r>
+        <w:rPr>
+          <w:rStyle w:val="VerbatimChar"/>
+        </w:rPr>
+        <w:t>-[мини отель]</w:t>
+      </w:r>
+      <w:r>
+        <w:rPr/>
+        <w:t xml:space="preserve">, </w:t>
+      </w:r>
+      <w:r>
+        <w:rPr>
+          <w:rStyle w:val="VerbatimChar"/>
+        </w:rPr>
+        <w:t>-[мини бар]</w:t>
+      </w:r>
+      <w:r>
+        <w:rPr/>
+        <w:t>.</w:t>
       </w:r>
     </w:p>
     <w:p>
@@ -8540,6 +8514,36 @@
         <w:rPr>
           <w:rStyle w:val="VerbatimChar"/>
         </w:rPr>
+        <w:t>-отзывы</w:t>
+      </w:r>
+      <w:r>
+        <w:rPr/>
+        <w:t xml:space="preserve"> — при снятии нужно следить, чтобы реклама не крутилась по «отзывы сотрудников», «плохие отзывы» (отрицательные сентименты); добавить </w:t>
+      </w:r>
+      <w:r>
+        <w:rPr>
+          <w:rStyle w:val="VerbatimChar"/>
+        </w:rPr>
+        <w:t>-!плохие -!негативные</w:t>
+      </w:r>
+      <w:r>
+        <w:rPr/>
+        <w:t xml:space="preserve"> как защиту.</w:t>
+      </w:r>
+    </w:p>
+    <w:p>
+      <w:pPr>
+        <w:pStyle w:val="Compact"/>
+        <w:numPr>
+          <w:ilvl w:val="0"/>
+          <w:numId w:val="43"/>
+        </w:numPr>
+        <w:rPr/>
+      </w:pPr>
+      <w:r>
+        <w:rPr>
+          <w:rStyle w:val="VerbatimChar"/>
+        </w:rPr>
         <w:t>-новатор</w:t>
       </w:r>
       <w:r>
@@ -8575,7 +8579,7 @@
         <w:pStyle w:val="Compact"/>
         <w:numPr>
           <w:ilvl w:val="0"/>
-          <w:numId w:val="43"/>
+          <w:numId w:val="44"/>
         </w:numPr>
         <w:rPr/>
       </w:pPr>
@@ -8662,20 +8666,6 @@
       <w:r>
         <w:rPr/>
         <w:t xml:space="preserve"> — сначала проверить в интерфейсе, не удалять вслепую.</w:t>
-      </w:r>
-    </w:p>
-    <w:p>
-      <w:pPr>
-        <w:pStyle w:val="Compact"/>
-        <w:numPr>
-          <w:ilvl w:val="0"/>
-          <w:numId w:val="44"/>
-        </w:numPr>
-        <w:rPr/>
-      </w:pPr>
-      <w:r>
-        <w:rPr/>
-        <w:t>Для каждого снятого общего минуса добавить фразовые/точные минусы против мусорного трафика (см. оговорку выше).</w:t>
       </w:r>
     </w:p>
     <w:p>
@@ -8689,6 +8679,20 @@
       </w:pPr>
       <w:r>
         <w:rPr/>
+        <w:t>Для каждого снятого общего минуса добавить фразовые/точные минусы против мусорного трафика (см. оговорку выше).</w:t>
+      </w:r>
+    </w:p>
+    <w:p>
+      <w:pPr>
+        <w:pStyle w:val="Compact"/>
+        <w:numPr>
+          <w:ilvl w:val="0"/>
+          <w:numId w:val="46"/>
+        </w:numPr>
+        <w:rPr/>
+      </w:pPr>
+      <w:r>
+        <w:rPr/>
         <w:t xml:space="preserve">Проверить в интерфейсе Директа, что минусы распределены </w:t>
       </w:r>
       <w:r>
@@ -8718,7 +8722,7 @@
         <w:pStyle w:val="Compact"/>
         <w:numPr>
           <w:ilvl w:val="0"/>
-          <w:numId w:val="46"/>
+          <w:numId w:val="47"/>
         </w:numPr>
         <w:rPr/>
       </w:pPr>
@@ -11164,27 +11168,13 @@
         <w:pStyle w:val="Compact"/>
         <w:numPr>
           <w:ilvl w:val="0"/>
-          <w:numId w:val="47"/>
-        </w:numPr>
-        <w:rPr/>
-      </w:pPr>
-      <w:r>
-        <w:rPr/>
-        <w:t>Добавить головные региональные запросы в кампании</w:t>
-      </w:r>
-    </w:p>
-    <w:p>
-      <w:pPr>
-        <w:pStyle w:val="Compact"/>
-        <w:numPr>
-          <w:ilvl w:val="0"/>
           <w:numId w:val="48"/>
         </w:numPr>
         <w:rPr/>
       </w:pPr>
       <w:r>
         <w:rPr/>
-        <w:t>Создать отдельную группу под замещающий спрос с собственными объявлениями («замена старой теплицы — новая со скидкой»).</w:t>
+        <w:t>Добавить головные региональные запросы в кампании</w:t>
       </w:r>
     </w:p>
     <w:p>
@@ -11193,6 +11183,20 @@
         <w:numPr>
           <w:ilvl w:val="0"/>
           <w:numId w:val="49"/>
+        </w:numPr>
+        <w:rPr/>
+      </w:pPr>
+      <w:r>
+        <w:rPr/>
+        <w:t>Создать отдельную группу под замещающий спрос с собственными объявлениями («замена старой теплицы — новая со скидкой»).</w:t>
+      </w:r>
+    </w:p>
+    <w:p>
+      <w:pPr>
+        <w:pStyle w:val="Compact"/>
+        <w:numPr>
+          <w:ilvl w:val="0"/>
+          <w:numId w:val="50"/>
         </w:numPr>
         <w:rPr/>
       </w:pPr>
@@ -13957,7 +13961,7 @@
         <w:pStyle w:val="Compact"/>
         <w:numPr>
           <w:ilvl w:val="0"/>
-          <w:numId w:val="50"/>
+          <w:numId w:val="51"/>
         </w:numPr>
         <w:rPr/>
       </w:pPr>
@@ -13978,7 +13982,7 @@
         <w:pStyle w:val="Compact"/>
         <w:numPr>
           <w:ilvl w:val="0"/>
-          <w:numId w:val="51"/>
+          <w:numId w:val="52"/>
         </w:numPr>
         <w:rPr/>
       </w:pPr>
@@ -14009,7 +14013,7 @@
         <w:pStyle w:val="Compact"/>
         <w:numPr>
           <w:ilvl w:val="0"/>
-          <w:numId w:val="52"/>
+          <w:numId w:val="53"/>
         </w:numPr>
         <w:rPr/>
       </w:pPr>
@@ -14042,7 +14046,7 @@
         <w:pStyle w:val="Compact"/>
         <w:numPr>
           <w:ilvl w:val="0"/>
-          <w:numId w:val="53"/>
+          <w:numId w:val="54"/>
         </w:numPr>
         <w:rPr/>
       </w:pPr>
@@ -14063,7 +14067,7 @@
         <w:pStyle w:val="Compact"/>
         <w:numPr>
           <w:ilvl w:val="0"/>
-          <w:numId w:val="54"/>
+          <w:numId w:val="55"/>
         </w:numPr>
         <w:rPr/>
       </w:pPr>
@@ -14094,7 +14098,7 @@
         <w:pStyle w:val="Compact"/>
         <w:numPr>
           <w:ilvl w:val="0"/>
-          <w:numId w:val="55"/>
+          <w:numId w:val="56"/>
         </w:numPr>
         <w:rPr/>
       </w:pPr>
@@ -14123,7 +14127,7 @@
         <w:pStyle w:val="Compact"/>
         <w:numPr>
           <w:ilvl w:val="0"/>
-          <w:numId w:val="56"/>
+          <w:numId w:val="57"/>
         </w:numPr>
         <w:rPr/>
       </w:pPr>
@@ -14228,7 +14232,7 @@
         <w:pStyle w:val="Compact"/>
         <w:numPr>
           <w:ilvl w:val="0"/>
-          <w:numId w:val="57"/>
+          <w:numId w:val="58"/>
         </w:numPr>
         <w:rPr/>
       </w:pPr>
@@ -14249,7 +14253,7 @@
         <w:pStyle w:val="Compact"/>
         <w:numPr>
           <w:ilvl w:val="0"/>
-          <w:numId w:val="58"/>
+          <w:numId w:val="59"/>
         </w:numPr>
         <w:rPr/>
       </w:pPr>
@@ -14280,7 +14284,7 @@
         <w:pStyle w:val="Compact"/>
         <w:numPr>
           <w:ilvl w:val="0"/>
-          <w:numId w:val="59"/>
+          <w:numId w:val="60"/>
         </w:numPr>
         <w:rPr/>
       </w:pPr>
@@ -14301,7 +14305,7 @@
         <w:pStyle w:val="Compact"/>
         <w:numPr>
           <w:ilvl w:val="0"/>
-          <w:numId w:val="60"/>
+          <w:numId w:val="61"/>
         </w:numPr>
         <w:rPr/>
       </w:pPr>
@@ -14322,7 +14326,7 @@
         <w:pStyle w:val="Compact"/>
         <w:numPr>
           <w:ilvl w:val="0"/>
-          <w:numId w:val="61"/>
+          <w:numId w:val="62"/>
         </w:numPr>
         <w:rPr/>
       </w:pPr>
@@ -14343,7 +14347,7 @@
         <w:pStyle w:val="Compact"/>
         <w:numPr>
           <w:ilvl w:val="0"/>
-          <w:numId w:val="62"/>
+          <w:numId w:val="63"/>
         </w:numPr>
         <w:rPr/>
       </w:pPr>
@@ -15992,7 +15996,7 @@
         <w:pStyle w:val="Compact"/>
         <w:numPr>
           <w:ilvl w:val="0"/>
-          <w:numId w:val="63"/>
+          <w:numId w:val="64"/>
         </w:numPr>
         <w:rPr/>
       </w:pPr>
@@ -16013,7 +16017,7 @@
         <w:pStyle w:val="Compact"/>
         <w:numPr>
           <w:ilvl w:val="0"/>
-          <w:numId w:val="64"/>
+          <w:numId w:val="65"/>
         </w:numPr>
         <w:rPr/>
       </w:pPr>
@@ -16042,7 +16046,7 @@
         <w:pStyle w:val="Compact"/>
         <w:numPr>
           <w:ilvl w:val="0"/>
-          <w:numId w:val="65"/>
+          <w:numId w:val="66"/>
         </w:numPr>
         <w:rPr/>
       </w:pPr>
@@ -16078,7 +16082,7 @@
         <w:pStyle w:val="Compact"/>
         <w:numPr>
           <w:ilvl w:val="0"/>
-          <w:numId w:val="66"/>
+          <w:numId w:val="67"/>
         </w:numPr>
         <w:rPr/>
       </w:pPr>
@@ -16099,7 +16103,7 @@
         <w:pStyle w:val="Compact"/>
         <w:numPr>
           <w:ilvl w:val="0"/>
-          <w:numId w:val="67"/>
+          <w:numId w:val="68"/>
         </w:numPr>
         <w:rPr/>
       </w:pPr>
@@ -16190,7 +16194,7 @@
         <w:pStyle w:val="Compact"/>
         <w:numPr>
           <w:ilvl w:val="0"/>
-          <w:numId w:val="68"/>
+          <w:numId w:val="69"/>
         </w:numPr>
         <w:rPr/>
       </w:pPr>
@@ -16221,7 +16225,7 @@
         <w:pStyle w:val="Compact"/>
         <w:numPr>
           <w:ilvl w:val="0"/>
-          <w:numId w:val="69"/>
+          <w:numId w:val="70"/>
         </w:numPr>
         <w:rPr/>
       </w:pPr>
@@ -16316,7 +16320,7 @@
         <w:pStyle w:val="Compact"/>
         <w:numPr>
           <w:ilvl w:val="0"/>
-          <w:numId w:val="70"/>
+          <w:numId w:val="71"/>
         </w:numPr>
         <w:rPr/>
       </w:pPr>
@@ -16387,27 +16391,13 @@
         <w:pStyle w:val="Compact"/>
         <w:numPr>
           <w:ilvl w:val="0"/>
-          <w:numId w:val="71"/>
-        </w:numPr>
-        <w:rPr/>
-      </w:pPr>
-      <w:r>
-        <w:rPr/>
-        <w:t>Переписать объявления под «завод-производитель — гарантия 10 лет — Полигаль Восток — 12 лет производства». Убрать или заменить «Найдёте дешевле — сделаем скидку».</w:t>
-      </w:r>
-    </w:p>
-    <w:p>
-      <w:pPr>
-        <w:pStyle w:val="Compact"/>
-        <w:numPr>
-          <w:ilvl w:val="0"/>
           <w:numId w:val="72"/>
         </w:numPr>
         <w:rPr/>
       </w:pPr>
       <w:r>
         <w:rPr/>
-        <w:t>Добавить кампанию на замещающий спрос: «замена старой теплицы», «замена поликарбоната на теплице», «новая теплица взамен сломанной» (17 000+ показов/мес РФ).</w:t>
+        <w:t>Переписать объявления под «завод-производитель — гарантия 10 лет — Полигаль Восток — 12 лет производства». Убрать или заменить «Найдёте дешевле — сделаем скидку».</w:t>
       </w:r>
     </w:p>
     <w:p>
@@ -16416,6 +16406,20 @@
         <w:numPr>
           <w:ilvl w:val="0"/>
           <w:numId w:val="73"/>
+        </w:numPr>
+        <w:rPr/>
+      </w:pPr>
+      <w:r>
+        <w:rPr/>
+        <w:t>Добавить кампанию на замещающий спрос: «замена старой теплицы», «замена поликарбоната на теплице», «новая теплица взамен сломанной» (17 000+ показов/мес РФ).</w:t>
+      </w:r>
+    </w:p>
+    <w:p>
+      <w:pPr>
+        <w:pStyle w:val="Compact"/>
+        <w:numPr>
+          <w:ilvl w:val="0"/>
+          <w:numId w:val="74"/>
         </w:numPr>
         <w:rPr/>
       </w:pPr>
@@ -16573,7 +16577,7 @@
         <w:pStyle w:val="Compact"/>
         <w:numPr>
           <w:ilvl w:val="0"/>
-          <w:numId w:val="74"/>
+          <w:numId w:val="75"/>
         </w:numPr>
         <w:rPr/>
       </w:pPr>
@@ -16594,7 +16598,7 @@
         <w:pStyle w:val="Compact"/>
         <w:numPr>
           <w:ilvl w:val="0"/>
-          <w:numId w:val="75"/>
+          <w:numId w:val="76"/>
         </w:numPr>
         <w:rPr/>
       </w:pPr>
@@ -16689,27 +16693,13 @@
         <w:pStyle w:val="Compact"/>
         <w:numPr>
           <w:ilvl w:val="0"/>
-          <w:numId w:val="76"/>
-        </w:numPr>
-        <w:rPr/>
-      </w:pPr>
-      <w:r>
-        <w:rPr/>
-        <w:t>Перевыгрузка семядра с актуальной датой, в разрезе 4 регионов, с верификацией колонок.</w:t>
-      </w:r>
-    </w:p>
-    <w:p>
-      <w:pPr>
-        <w:pStyle w:val="Compact"/>
-        <w:numPr>
-          <w:ilvl w:val="0"/>
           <w:numId w:val="77"/>
         </w:numPr>
         <w:rPr/>
       </w:pPr>
       <w:r>
         <w:rPr/>
-        <w:t>Полная таблица «фраза → посадочный URL» для всех 417 фраз.</w:t>
+        <w:t>Перевыгрузка семядра с актуальной датой, в разрезе 4 регионов, с верификацией колонок.</w:t>
       </w:r>
     </w:p>
     <w:p>
@@ -16723,7 +16713,7 @@
       </w:pPr>
       <w:r>
         <w:rPr/>
-        <w:t>Пересмотренный список минус-фраз с разнесением по кампаниям.</w:t>
+        <w:t>Полная таблица «фраза → посадочный URL» для всех 417 фраз.</w:t>
       </w:r>
     </w:p>
     <w:p>
@@ -16737,7 +16727,7 @@
       </w:pPr>
       <w:r>
         <w:rPr/>
-        <w:t>Правки в объявлениях по блоку.</w:t>
+        <w:t>Пересмотренный список минус-фраз с разнесением по кампаниям.</w:t>
       </w:r>
     </w:p>
     <w:p>
@@ -16746,6 +16736,20 @@
         <w:numPr>
           <w:ilvl w:val="0"/>
           <w:numId w:val="80"/>
+        </w:numPr>
+        <w:rPr/>
+      </w:pPr>
+      <w:r>
+        <w:rPr/>
+        <w:t>Правки в объявлениях по блоку.</w:t>
+      </w:r>
+    </w:p>
+    <w:p>
+      <w:pPr>
+        <w:pStyle w:val="Compact"/>
+        <w:numPr>
+          <w:ilvl w:val="0"/>
+          <w:numId w:val="81"/>
         </w:numPr>
         <w:rPr/>
       </w:pPr>
@@ -16864,7 +16868,7 @@
         <w:pStyle w:val="Compact"/>
         <w:numPr>
           <w:ilvl w:val="0"/>
-          <w:numId w:val="81"/>
+          <w:numId w:val="82"/>
         </w:numPr>
         <w:rPr/>
       </w:pPr>
@@ -16881,7 +16885,7 @@
         <w:pStyle w:val="Compact"/>
         <w:numPr>
           <w:ilvl w:val="0"/>
-          <w:numId w:val="82"/>
+          <w:numId w:val="83"/>
         </w:numPr>
         <w:rPr/>
       </w:pPr>
@@ -16895,7 +16899,7 @@
         <w:pStyle w:val="Compact"/>
         <w:numPr>
           <w:ilvl w:val="0"/>
-          <w:numId w:val="83"/>
+          <w:numId w:val="84"/>
         </w:numPr>
         <w:rPr/>
       </w:pPr>
@@ -17003,6 +17007,321 @@
         <w:rPr/>
       </w:pPr>
       <w:r>
+        <w:rPr/>
+      </w:r>
+    </w:p>
+    <w:p>
+      <w:pPr>
+        <w:pStyle w:val="BodyText"/>
+        <w:rPr/>
+      </w:pPr>
+      <w:r>
+        <w:rPr>
+          <w:rStyle w:val="Strong"/>
+        </w:rPr>
+        <w:t>Как читать таблицу:</w:t>
+      </w:r>
+    </w:p>
+    <w:p>
+      <w:pPr>
+        <w:pStyle w:val="BodyText"/>
+        <w:numPr>
+          <w:ilvl w:val="0"/>
+          <w:numId w:val="21"/>
+        </w:numPr>
+        <w:tabs>
+          <w:tab w:val="clear" w:pos="720"/>
+          <w:tab w:val="left" w:pos="0" w:leader="none"/>
+        </w:tabs>
+        <w:ind w:hanging="0" w:left="709"/>
+        <w:rPr/>
+      </w:pPr>
+      <w:r>
+        <w:rPr>
+          <w:rStyle w:val="Strong"/>
+        </w:rPr>
+        <w:t>Группа</w:t>
+      </w:r>
+      <w:r>
+        <w:rPr/>
+        <w:t> — название кластера из колонки «Группа» в вашем CSV.</w:t>
+      </w:r>
+    </w:p>
+    <w:p>
+      <w:pPr>
+        <w:pStyle w:val="BodyText"/>
+        <w:numPr>
+          <w:ilvl w:val="0"/>
+          <w:numId w:val="21"/>
+        </w:numPr>
+        <w:tabs>
+          <w:tab w:val="clear" w:pos="720"/>
+          <w:tab w:val="left" w:pos="0" w:leader="none"/>
+        </w:tabs>
+        <w:ind w:hanging="0" w:left="709"/>
+        <w:rPr/>
+      </w:pPr>
+      <w:r>
+        <w:rPr>
+          <w:rStyle w:val="Strong"/>
+        </w:rPr>
+        <w:t>#</w:t>
+      </w:r>
+      <w:r>
+        <w:rPr/>
+        <w:t> — диапазон номеров строк в полной таблице сверки (см. файл [[AZT — Полная сверка семядра с Wordstat 2026-04-19]]).</w:t>
+      </w:r>
+    </w:p>
+    <w:p>
+      <w:pPr>
+        <w:pStyle w:val="BodyText"/>
+        <w:numPr>
+          <w:ilvl w:val="0"/>
+          <w:numId w:val="21"/>
+        </w:numPr>
+        <w:tabs>
+          <w:tab w:val="clear" w:pos="720"/>
+          <w:tab w:val="left" w:pos="0" w:leader="none"/>
+        </w:tabs>
+        <w:ind w:hanging="0" w:left="709"/>
+        <w:rPr/>
+      </w:pPr>
+      <w:r>
+        <w:rPr>
+          <w:rStyle w:val="Strong"/>
+        </w:rPr>
+        <w:t>N</w:t>
+      </w:r>
+      <w:r>
+        <w:rPr/>
+        <w:t> — общее количество фраз в группе.</w:t>
+      </w:r>
+    </w:p>
+    <w:p>
+      <w:pPr>
+        <w:pStyle w:val="BodyText"/>
+        <w:numPr>
+          <w:ilvl w:val="0"/>
+          <w:numId w:val="21"/>
+        </w:numPr>
+        <w:tabs>
+          <w:tab w:val="clear" w:pos="720"/>
+          <w:tab w:val="left" w:pos="0" w:leader="none"/>
+        </w:tabs>
+        <w:ind w:hanging="0" w:left="709"/>
+        <w:rPr/>
+      </w:pPr>
+      <w:r>
+        <w:rPr>
+          <w:rStyle w:val="Strong"/>
+        </w:rPr>
+        <w:t>Занижено (сильно/умер.)</w:t>
+      </w:r>
+      <w:r>
+        <w:rPr/>
+        <w:t> — сколько фраз в группе с </w:t>
+      </w:r>
+      <w:r>
+        <w:rPr>
+          <w:rStyle w:val="Strong"/>
+        </w:rPr>
+        <w:t>реальной частотой &gt; вашей «Базы»</w:t>
+      </w:r>
+      <w:r>
+        <w:rPr/>
+        <w:t>. Через слеш разбивка: </w:t>
+      </w:r>
+      <w:r>
+        <w:rPr>
+          <w:rStyle w:val="Strong"/>
+        </w:rPr>
+        <w:t>сильно</w:t>
+      </w:r>
+      <w:r>
+        <w:rPr/>
+        <w:t> (отклонение &gt;+100%, т. е. реальный спрос больше чем вдвое) / </w:t>
+      </w:r>
+      <w:r>
+        <w:rPr>
+          <w:rStyle w:val="Strong"/>
+        </w:rPr>
+        <w:t>умер.</w:t>
+      </w:r>
+      <w:r>
+        <w:rPr/>
+        <w:t> (+20…+100%). Жирным — доминирующая категория в группе.</w:t>
+      </w:r>
+    </w:p>
+    <w:p>
+      <w:pPr>
+        <w:pStyle w:val="BodyText"/>
+        <w:numPr>
+          <w:ilvl w:val="0"/>
+          <w:numId w:val="21"/>
+        </w:numPr>
+        <w:tabs>
+          <w:tab w:val="clear" w:pos="720"/>
+          <w:tab w:val="left" w:pos="0" w:leader="none"/>
+        </w:tabs>
+        <w:ind w:hanging="0" w:left="709"/>
+        <w:rPr/>
+      </w:pPr>
+      <w:r>
+        <w:rPr>
+          <w:rStyle w:val="Strong"/>
+        </w:rPr>
+        <w:t>Завышено (сильно/умер.)</w:t>
+      </w:r>
+      <w:r>
+        <w:rPr/>
+        <w:t> — сколько фраз с </w:t>
+      </w:r>
+      <w:r>
+        <w:rPr>
+          <w:rStyle w:val="Strong"/>
+        </w:rPr>
+        <w:t>реальной частотой &lt; вашей «Базы»</w:t>
+      </w:r>
+      <w:r>
+        <w:rPr/>
+        <w:t>. Через слеш: </w:t>
+      </w:r>
+      <w:r>
+        <w:rPr>
+          <w:rStyle w:val="Strong"/>
+        </w:rPr>
+        <w:t>сильно</w:t>
+      </w:r>
+      <w:r>
+        <w:rPr/>
+        <w:t> (отклонение &lt;−50%) / </w:t>
+      </w:r>
+      <w:r>
+        <w:rPr>
+          <w:rStyle w:val="Strong"/>
+        </w:rPr>
+        <w:t>умер.</w:t>
+      </w:r>
+      <w:r>
+        <w:rPr/>
+        <w:t> (−20…−50%).</w:t>
+      </w:r>
+    </w:p>
+    <w:p>
+      <w:pPr>
+        <w:pStyle w:val="BodyText"/>
+        <w:numPr>
+          <w:ilvl w:val="0"/>
+          <w:numId w:val="21"/>
+        </w:numPr>
+        <w:tabs>
+          <w:tab w:val="clear" w:pos="720"/>
+          <w:tab w:val="left" w:pos="0" w:leader="none"/>
+        </w:tabs>
+        <w:ind w:hanging="0" w:left="709"/>
+        <w:rPr/>
+      </w:pPr>
+      <w:r>
+        <w:rPr>
+          <w:rStyle w:val="Strong"/>
+        </w:rPr>
+        <w:t>Близко</w:t>
+      </w:r>
+      <w:r>
+        <w:rPr/>
+        <w:t> — фразы с отклонением ±20% (ваша оценка совпадает с реальностью).</w:t>
+      </w:r>
+    </w:p>
+    <w:p>
+      <w:pPr>
+        <w:pStyle w:val="BodyText"/>
+        <w:numPr>
+          <w:ilvl w:val="0"/>
+          <w:numId w:val="21"/>
+        </w:numPr>
+        <w:tabs>
+          <w:tab w:val="clear" w:pos="720"/>
+          <w:tab w:val="left" w:pos="0" w:leader="none"/>
+        </w:tabs>
+        <w:ind w:hanging="0" w:left="709"/>
+        <w:rPr/>
+      </w:pPr>
+      <w:r>
+        <w:rPr>
+          <w:rStyle w:val="Strong"/>
+        </w:rPr>
+        <w:t>Пусто</w:t>
+      </w:r>
+      <w:r>
+        <w:rPr/>
+        <w:t> — фразы с Wordstat = 0 (в CSV проставлена частота, но реального спроса нет).</w:t>
+      </w:r>
+    </w:p>
+    <w:p>
+      <w:pPr>
+        <w:pStyle w:val="BodyText"/>
+        <w:numPr>
+          <w:ilvl w:val="0"/>
+          <w:numId w:val="21"/>
+        </w:numPr>
+        <w:tabs>
+          <w:tab w:val="clear" w:pos="720"/>
+          <w:tab w:val="left" w:pos="0" w:leader="none"/>
+        </w:tabs>
+        <w:ind w:hanging="0" w:left="709"/>
+        <w:rPr/>
+      </w:pPr>
+      <w:r>
+        <w:rPr>
+          <w:rStyle w:val="Strong"/>
+        </w:rPr>
+        <w:t>Max дельта</w:t>
+      </w:r>
+      <w:r>
+        <w:rPr/>
+        <w:t> — максимальное занижение в группе (самая недооценённая фраза, прочерк — если в группе нет занижений).</w:t>
+      </w:r>
+    </w:p>
+    <w:p>
+      <w:pPr>
+        <w:pStyle w:val="BodyText"/>
+        <w:numPr>
+          <w:ilvl w:val="0"/>
+          <w:numId w:val="21"/>
+        </w:numPr>
+        <w:tabs>
+          <w:tab w:val="clear" w:pos="720"/>
+          <w:tab w:val="left" w:pos="0" w:leader="none"/>
+        </w:tabs>
+        <w:ind w:hanging="0" w:left="709"/>
+        <w:rPr/>
+      </w:pPr>
+      <w:r>
+        <w:rPr>
+          <w:rStyle w:val="Strong"/>
+        </w:rPr>
+        <w:t>Min дельта</w:t>
+      </w:r>
+      <w:r>
+        <w:rPr/>
+        <w:t> — максимальное завышение в группе (самая переоценённая фраза, прочерк — если нет завышений).</w:t>
+      </w:r>
+    </w:p>
+    <w:p>
+      <w:pPr>
+        <w:pStyle w:val="BodyText"/>
+        <w:rPr/>
+      </w:pPr>
+      <w:r>
+        <w:rPr/>
+      </w:r>
+    </w:p>
+    <w:p>
+      <w:pPr>
+        <w:pStyle w:val="BodyText"/>
+        <w:rPr/>
+      </w:pPr>
+      <w:r>
         <w:rPr>
           <w:b/>
           <w:bCs/>
@@ -23074,7 +23393,7 @@
         <w:pStyle w:val="Compact"/>
         <w:numPr>
           <w:ilvl w:val="0"/>
-          <w:numId w:val="84"/>
+          <w:numId w:val="85"/>
         </w:numPr>
         <w:rPr/>
       </w:pPr>
@@ -23105,7 +23424,7 @@
         <w:pStyle w:val="Compact"/>
         <w:numPr>
           <w:ilvl w:val="0"/>
-          <w:numId w:val="85"/>
+          <w:numId w:val="86"/>
         </w:numPr>
         <w:rPr/>
       </w:pPr>
@@ -23136,7 +23455,7 @@
         <w:pStyle w:val="Compact"/>
         <w:numPr>
           <w:ilvl w:val="0"/>
-          <w:numId w:val="86"/>
+          <w:numId w:val="87"/>
         </w:numPr>
         <w:rPr/>
       </w:pPr>
@@ -23157,7 +23476,7 @@
         <w:pStyle w:val="Compact"/>
         <w:numPr>
           <w:ilvl w:val="0"/>
-          <w:numId w:val="87"/>
+          <w:numId w:val="88"/>
         </w:numPr>
         <w:rPr/>
       </w:pPr>
@@ -23188,7 +23507,7 @@
         <w:pStyle w:val="Compact"/>
         <w:numPr>
           <w:ilvl w:val="0"/>
-          <w:numId w:val="88"/>
+          <w:numId w:val="89"/>
         </w:numPr>
         <w:rPr/>
       </w:pPr>
@@ -23219,7 +23538,7 @@
         <w:pStyle w:val="Compact"/>
         <w:numPr>
           <w:ilvl w:val="0"/>
-          <w:numId w:val="89"/>
+          <w:numId w:val="90"/>
         </w:numPr>
         <w:rPr/>
       </w:pPr>
@@ -23260,7 +23579,7 @@
         <w:pStyle w:val="Compact"/>
         <w:numPr>
           <w:ilvl w:val="0"/>
-          <w:numId w:val="90"/>
+          <w:numId w:val="91"/>
         </w:numPr>
         <w:rPr/>
       </w:pPr>
@@ -23291,7 +23610,7 @@
         <w:pStyle w:val="Compact"/>
         <w:numPr>
           <w:ilvl w:val="0"/>
-          <w:numId w:val="91"/>
+          <w:numId w:val="92"/>
         </w:numPr>
         <w:rPr/>
       </w:pPr>
@@ -23333,7 +23652,7 @@
         <w:pStyle w:val="Compact"/>
         <w:numPr>
           <w:ilvl w:val="0"/>
-          <w:numId w:val="92"/>
+          <w:numId w:val="93"/>
         </w:numPr>
         <w:rPr/>
       </w:pPr>
@@ -23377,7 +23696,7 @@
         <w:pStyle w:val="Compact"/>
         <w:numPr>
           <w:ilvl w:val="0"/>
-          <w:numId w:val="93"/>
+          <w:numId w:val="94"/>
         </w:numPr>
         <w:rPr/>
       </w:pPr>
@@ -23468,7 +23787,7 @@
         <w:pStyle w:val="Compact"/>
         <w:numPr>
           <w:ilvl w:val="0"/>
-          <w:numId w:val="94"/>
+          <w:numId w:val="95"/>
         </w:numPr>
         <w:rPr/>
       </w:pPr>
@@ -23539,7 +23858,7 @@
         <w:pStyle w:val="Compact"/>
         <w:numPr>
           <w:ilvl w:val="0"/>
-          <w:numId w:val="95"/>
+          <w:numId w:val="96"/>
         </w:numPr>
         <w:rPr/>
       </w:pPr>
@@ -27161,6 +27480,144 @@
     </w:lvl>
   </w:abstractNum>
   <w:abstractNum w:abstractNumId="21">
+    <w:lvl w:ilvl="0">
+      <w:start w:val="1"/>
+      <w:numFmt w:val="bullet"/>
+      <w:suff w:val="nothing"/>
+      <w:lvlText w:val=""/>
+      <w:lvlJc w:val="left"/>
+      <w:pPr>
+        <w:tabs>
+          <w:tab w:val="num" w:pos="709"/>
+        </w:tabs>
+        <w:ind w:left="709" w:hanging="0"/>
+      </w:pPr>
+      <w:rPr>
+        <w:rFonts w:ascii="Symbol" w:hAnsi="Symbol" w:cs="Symbol" w:hint="default"/>
+      </w:rPr>
+    </w:lvl>
+    <w:lvl w:ilvl="1">
+      <w:start w:val="1"/>
+      <w:numFmt w:val="bullet"/>
+      <w:lvlText w:val=""/>
+      <w:lvlJc w:val="left"/>
+      <w:pPr>
+        <w:tabs>
+          <w:tab w:val="num" w:pos="1418"/>
+        </w:tabs>
+        <w:ind w:left="1418" w:hanging="283"/>
+      </w:pPr>
+      <w:rPr>
+        <w:rFonts w:ascii="Symbol" w:hAnsi="Symbol" w:cs="Symbol" w:hint="default"/>
+      </w:rPr>
+    </w:lvl>
+    <w:lvl w:ilvl="2">
+      <w:start w:val="1"/>
+      <w:numFmt w:val="bullet"/>
+      <w:lvlText w:val=""/>
+      <w:lvlJc w:val="left"/>
+      <w:pPr>
+        <w:tabs>
+          <w:tab w:val="num" w:pos="2127"/>
+        </w:tabs>
+        <w:ind w:left="2127" w:hanging="283"/>
+      </w:pPr>
+      <w:rPr>
+        <w:rFonts w:ascii="Symbol" w:hAnsi="Symbol" w:cs="Symbol" w:hint="default"/>
+      </w:rPr>
+    </w:lvl>
+    <w:lvl w:ilvl="3">
+      <w:start w:val="1"/>
+      <w:numFmt w:val="bullet"/>
+      <w:lvlText w:val=""/>
+      <w:lvlJc w:val="left"/>
+      <w:pPr>
+        <w:tabs>
+          <w:tab w:val="num" w:pos="2836"/>
+        </w:tabs>
+        <w:ind w:left="2836" w:hanging="283"/>
+      </w:pPr>
+      <w:rPr>
+        <w:rFonts w:ascii="Symbol" w:hAnsi="Symbol" w:cs="Symbol" w:hint="default"/>
+      </w:rPr>
+    </w:lvl>
+    <w:lvl w:ilvl="4">
+      <w:start w:val="1"/>
+      <w:numFmt w:val="bullet"/>
+      <w:lvlText w:val=""/>
+      <w:lvlJc w:val="left"/>
+      <w:pPr>
+        <w:tabs>
+          <w:tab w:val="num" w:pos="3545"/>
+        </w:tabs>
+        <w:ind w:left="3545" w:hanging="283"/>
+      </w:pPr>
+      <w:rPr>
+        <w:rFonts w:ascii="Symbol" w:hAnsi="Symbol" w:cs="Symbol" w:hint="default"/>
+      </w:rPr>
+    </w:lvl>
+    <w:lvl w:ilvl="5">
+      <w:start w:val="1"/>
+      <w:numFmt w:val="bullet"/>
+      <w:lvlText w:val=""/>
+      <w:lvlJc w:val="left"/>
+      <w:pPr>
+        <w:tabs>
+          <w:tab w:val="num" w:pos="4254"/>
+        </w:tabs>
+        <w:ind w:left="4254" w:hanging="283"/>
+      </w:pPr>
+      <w:rPr>
+        <w:rFonts w:ascii="Symbol" w:hAnsi="Symbol" w:cs="Symbol" w:hint="default"/>
+      </w:rPr>
+    </w:lvl>
+    <w:lvl w:ilvl="6">
+      <w:start w:val="1"/>
+      <w:numFmt w:val="bullet"/>
+      <w:lvlText w:val=""/>
+      <w:lvlJc w:val="left"/>
+      <w:pPr>
+        <w:tabs>
+          <w:tab w:val="num" w:pos="4963"/>
+        </w:tabs>
+        <w:ind w:left="4963" w:hanging="283"/>
+      </w:pPr>
+      <w:rPr>
+        <w:rFonts w:ascii="Symbol" w:hAnsi="Symbol" w:cs="Symbol" w:hint="default"/>
+      </w:rPr>
+    </w:lvl>
+    <w:lvl w:ilvl="7">
+      <w:start w:val="1"/>
+      <w:numFmt w:val="bullet"/>
+      <w:lvlText w:val=""/>
+      <w:lvlJc w:val="left"/>
+      <w:pPr>
+        <w:tabs>
+          <w:tab w:val="num" w:pos="5672"/>
+        </w:tabs>
+        <w:ind w:left="5672" w:hanging="283"/>
+      </w:pPr>
+      <w:rPr>
+        <w:rFonts w:ascii="Symbol" w:hAnsi="Symbol" w:cs="Symbol" w:hint="default"/>
+      </w:rPr>
+    </w:lvl>
+    <w:lvl w:ilvl="8">
+      <w:start w:val="1"/>
+      <w:numFmt w:val="bullet"/>
+      <w:lvlText w:val=""/>
+      <w:lvlJc w:val="left"/>
+      <w:pPr>
+        <w:tabs>
+          <w:tab w:val="num" w:pos="6381"/>
+        </w:tabs>
+        <w:ind w:left="6381" w:hanging="283"/>
+      </w:pPr>
+      <w:rPr>
+        <w:rFonts w:ascii="Symbol" w:hAnsi="Symbol" w:cs="Symbol" w:hint="default"/>
+      </w:rPr>
+    </w:lvl>
+  </w:abstractNum>
+  <w:abstractNum w:abstractNumId="22">
     <w:lvl w:ilvl="0">
       <w:start w:val="1"/>
       <w:numFmt w:val="none"/>
@@ -27343,7 +27800,7 @@
     <w:abstractNumId w:val="21"/>
   </w:num>
   <w:num w:numId="22">
-    <w:abstractNumId w:val="1"/>
+    <w:abstractNumId w:val="22"/>
   </w:num>
   <w:num w:numId="23">
     <w:abstractNumId w:val="1"/>
@@ -27355,13 +27812,13 @@
     <w:abstractNumId w:val="1"/>
   </w:num>
   <w:num w:numId="26">
+    <w:abstractNumId w:val="1"/>
+  </w:num>
+  <w:num w:numId="27">
     <w:abstractNumId w:val="3"/>
     <w:lvlOverride w:ilvl="0">
       <w:startOverride w:val="1"/>
     </w:lvlOverride>
-  </w:num>
-  <w:num w:numId="27">
-    <w:abstractNumId w:val="1"/>
   </w:num>
   <w:num w:numId="28">
     <w:abstractNumId w:val="1"/>
@@ -27409,13 +27866,13 @@
     <w:abstractNumId w:val="1"/>
   </w:num>
   <w:num w:numId="43">
+    <w:abstractNumId w:val="1"/>
+  </w:num>
+  <w:num w:numId="44">
     <w:abstractNumId w:val="3"/>
     <w:lvlOverride w:ilvl="0">
       <w:startOverride w:val="1"/>
     </w:lvlOverride>
-  </w:num>
-  <w:num w:numId="44">
-    <w:abstractNumId w:val="3"/>
   </w:num>
   <w:num w:numId="45">
     <w:abstractNumId w:val="3"/>
@@ -27425,18 +27882,18 @@
   </w:num>
   <w:num w:numId="47">
     <w:abstractNumId w:val="3"/>
+  </w:num>
+  <w:num w:numId="48">
+    <w:abstractNumId w:val="3"/>
     <w:lvlOverride w:ilvl="0">
       <w:startOverride w:val="1"/>
     </w:lvlOverride>
-  </w:num>
-  <w:num w:numId="48">
-    <w:abstractNumId w:val="3"/>
   </w:num>
   <w:num w:numId="49">
     <w:abstractNumId w:val="3"/>
   </w:num>
   <w:num w:numId="50">
-    <w:abstractNumId w:val="1"/>
+    <w:abstractNumId w:val="3"/>
   </w:num>
   <w:num w:numId="51">
     <w:abstractNumId w:val="1"/>
@@ -27445,13 +27902,13 @@
     <w:abstractNumId w:val="1"/>
   </w:num>
   <w:num w:numId="53">
+    <w:abstractNumId w:val="1"/>
+  </w:num>
+  <w:num w:numId="54">
     <w:abstractNumId w:val="3"/>
     <w:lvlOverride w:ilvl="0">
       <w:startOverride w:val="1"/>
     </w:lvlOverride>
-  </w:num>
-  <w:num w:numId="54">
-    <w:abstractNumId w:val="3"/>
   </w:num>
   <w:num w:numId="55">
     <w:abstractNumId w:val="3"/>
@@ -27460,7 +27917,7 @@
     <w:abstractNumId w:val="3"/>
   </w:num>
   <w:num w:numId="57">
-    <w:abstractNumId w:val="1"/>
+    <w:abstractNumId w:val="3"/>
   </w:num>
   <w:num w:numId="58">
     <w:abstractNumId w:val="1"/>
@@ -27478,13 +27935,13 @@
     <w:abstractNumId w:val="1"/>
   </w:num>
   <w:num w:numId="63">
+    <w:abstractNumId w:val="1"/>
+  </w:num>
+  <w:num w:numId="64">
     <w:abstractNumId w:val="3"/>
     <w:lvlOverride w:ilvl="0">
       <w:startOverride w:val="1"/>
     </w:lvlOverride>
-  </w:num>
-  <w:num w:numId="64">
-    <w:abstractNumId w:val="3"/>
   </w:num>
   <w:num w:numId="65">
     <w:abstractNumId w:val="3"/>
@@ -27503,12 +27960,12 @@
   </w:num>
   <w:num w:numId="70">
     <w:abstractNumId w:val="3"/>
+  </w:num>
+  <w:num w:numId="71">
+    <w:abstractNumId w:val="3"/>
     <w:lvlOverride w:ilvl="0">
       <w:startOverride w:val="1"/>
     </w:lvlOverride>
-  </w:num>
-  <w:num w:numId="71">
-    <w:abstractNumId w:val="3"/>
   </w:num>
   <w:num w:numId="72">
     <w:abstractNumId w:val="3"/>
@@ -27518,21 +27975,21 @@
   </w:num>
   <w:num w:numId="74">
     <w:abstractNumId w:val="3"/>
-    <w:lvlOverride w:ilvl="0">
-      <w:startOverride w:val="1"/>
-    </w:lvlOverride>
   </w:num>
   <w:num w:numId="75">
-    <w:abstractNumId w:val="3"/>
-  </w:num>
-  <w:num w:numId="76">
     <w:abstractNumId w:val="3"/>
     <w:lvlOverride w:ilvl="0">
       <w:startOverride w:val="1"/>
     </w:lvlOverride>
   </w:num>
+  <w:num w:numId="76">
+    <w:abstractNumId w:val="3"/>
+  </w:num>
   <w:num w:numId="77">
     <w:abstractNumId w:val="3"/>
+    <w:lvlOverride w:ilvl="0">
+      <w:startOverride w:val="1"/>
+    </w:lvlOverride>
   </w:num>
   <w:num w:numId="78">
     <w:abstractNumId w:val="3"/>
@@ -27544,7 +28001,7 @@
     <w:abstractNumId w:val="3"/>
   </w:num>
   <w:num w:numId="81">
-    <w:abstractNumId w:val="1"/>
+    <w:abstractNumId w:val="3"/>
   </w:num>
   <w:num w:numId="82">
     <w:abstractNumId w:val="1"/>
@@ -27586,6 +28043,9 @@
     <w:abstractNumId w:val="1"/>
   </w:num>
   <w:num w:numId="95">
+    <w:abstractNumId w:val="1"/>
+  </w:num>
+  <w:num w:numId="96">
     <w:abstractNumId w:val="1"/>
   </w:num>
 </w:numbering>
@@ -28121,7 +28581,22 @@
     <w:qFormat/>
     <w:rPr/>
   </w:style>
-  <w:style w:type="paragraph" w:styleId="Style6">
+  <w:style w:type="character" w:styleId="Style6">
+    <w:name w:val="Маркеры"/>
+    <w:qFormat/>
+    <w:rPr>
+      <w:rFonts w:ascii="OpenSymbol" w:hAnsi="OpenSymbol" w:eastAsia="OpenSymbol" w:cs="OpenSymbol"/>
+    </w:rPr>
+  </w:style>
+  <w:style w:type="character" w:styleId="Strong">
+    <w:name w:val="Strong"/>
+    <w:qFormat/>
+    <w:rPr>
+      <w:b/>
+      <w:bCs/>
+    </w:rPr>
+  </w:style>
+  <w:style w:type="paragraph" w:styleId="Style7">
     <w:name w:val="Заголовок"/>
     <w:basedOn w:val="Normal"/>
     <w:next w:val="BodyText"/>
@@ -28166,7 +28641,7 @@
       <w:i/>
     </w:rPr>
   </w:style>
-  <w:style w:type="paragraph" w:styleId="Style7">
+  <w:style w:type="paragraph" w:styleId="Style8">
     <w:name w:val="Указатель"/>
     <w:basedOn w:val="Normal"/>
     <w:qFormat/>
@@ -28371,7 +28846,7 @@
     <w:pPr/>
     <w:rPr/>
   </w:style>
-  <w:style w:type="paragraph" w:styleId="Style8" w:customStyle="1">
+  <w:style w:type="paragraph" w:styleId="Style9" w:customStyle="1">
     <w:name w:val="Фигура"/>
     <w:basedOn w:val="Normal"/>
     <w:qFormat/>
@@ -28380,7 +28855,7 @@
   </w:style>
   <w:style w:type="paragraph" w:styleId="CaptionedFigure" w:customStyle="1">
     <w:name w:val="Captioned Figure"/>
-    <w:basedOn w:val="Style8"/>
+    <w:basedOn w:val="Style9"/>
     <w:qFormat/>
     <w:pPr>
       <w:keepNext w:val="true"/>
@@ -28389,7 +28864,7 @@
   </w:style>
   <w:style w:type="paragraph" w:styleId="IndexHeading">
     <w:name w:val="Index Heading"/>
-    <w:basedOn w:val="Style6"/>
+    <w:basedOn w:val="Style7"/>
     <w:pPr/>
     <w:rPr/>
   </w:style>

</xml_diff>

<commit_message>
vault backup: 2026-04-21 13:59:42
</commit_message>
<xml_diff>
--- a/dev/10 Projects/AZT/07_output/agency/AZT — Правки к плану агентства (расширенная сверка) 2026-04-20.docx
+++ b/dev/10 Projects/AZT/07_output/agency/AZT — Правки к плану агентства (расширенная сверка) 2026-04-20.docx
@@ -14004,7 +14004,7 @@
     <w:tbl>
       <w:tblPr>
         <w:tblStyle w:val="Table"/>
-        <w:tblW w:w="7920" w:type="dxa"/>
+        <w:tblW w:w="9630" w:type="dxa"/>
         <w:jc w:val="left"/>
         <w:tblInd w:w="108" w:type="dxa"/>
         <w:tblLayout w:type="fixed"/>
@@ -14017,11 +14017,11 @@
         <w:tblLook w:val="0020" w:noHBand="0" w:noVBand="0" w:firstColumn="0" w:lastRow="0" w:lastColumn="0" w:firstRow="1"/>
       </w:tblPr>
       <w:tblGrid>
-        <w:gridCol w:w="1584"/>
-        <w:gridCol w:w="1584"/>
-        <w:gridCol w:w="1584"/>
-        <w:gridCol w:w="1584"/>
-        <w:gridCol w:w="1584"/>
+        <w:gridCol w:w="2490"/>
+        <w:gridCol w:w="1185"/>
+        <w:gridCol w:w="1077"/>
+        <w:gridCol w:w="2208"/>
+        <w:gridCol w:w="2670"/>
       </w:tblGrid>
       <w:tr>
         <w:trPr>
@@ -14029,7 +14029,7 @@
         </w:trPr>
         <w:tc>
           <w:tcPr>
-            <w:tcW w:w="1584" w:type="dxa"/>
+            <w:tcW w:w="2490" w:type="dxa"/>
             <w:tcBorders>
               <w:bottom w:val="single" w:sz="6" w:space="0" w:color="000000"/>
             </w:tcBorders>
@@ -14063,7 +14063,7 @@
         </w:tc>
         <w:tc>
           <w:tcPr>
-            <w:tcW w:w="1584" w:type="dxa"/>
+            <w:tcW w:w="1185" w:type="dxa"/>
             <w:tcBorders>
               <w:bottom w:val="single" w:sz="6" w:space="0" w:color="000000"/>
             </w:tcBorders>
@@ -14097,7 +14097,7 @@
         </w:tc>
         <w:tc>
           <w:tcPr>
-            <w:tcW w:w="1584" w:type="dxa"/>
+            <w:tcW w:w="1077" w:type="dxa"/>
             <w:tcBorders>
               <w:bottom w:val="single" w:sz="6" w:space="0" w:color="000000"/>
             </w:tcBorders>
@@ -14131,7 +14131,7 @@
         </w:tc>
         <w:tc>
           <w:tcPr>
-            <w:tcW w:w="1584" w:type="dxa"/>
+            <w:tcW w:w="2208" w:type="dxa"/>
             <w:tcBorders>
               <w:bottom w:val="single" w:sz="6" w:space="0" w:color="000000"/>
             </w:tcBorders>
@@ -14165,7 +14165,7 @@
         </w:tc>
         <w:tc>
           <w:tcPr>
-            <w:tcW w:w="1584" w:type="dxa"/>
+            <w:tcW w:w="2670" w:type="dxa"/>
             <w:tcBorders>
               <w:bottom w:val="single" w:sz="6" w:space="0" w:color="000000"/>
             </w:tcBorders>
@@ -14202,7 +14202,7 @@
         <w:trPr/>
         <w:tc>
           <w:tcPr>
-            <w:tcW w:w="1584" w:type="dxa"/>
+            <w:tcW w:w="2490" w:type="dxa"/>
             <w:tcBorders/>
           </w:tcPr>
           <w:p>
@@ -14233,7 +14233,7 @@
         </w:tc>
         <w:tc>
           <w:tcPr>
-            <w:tcW w:w="1584" w:type="dxa"/>
+            <w:tcW w:w="1185" w:type="dxa"/>
             <w:tcBorders/>
           </w:tcPr>
           <w:p>
@@ -14264,7 +14264,7 @@
         </w:tc>
         <w:tc>
           <w:tcPr>
-            <w:tcW w:w="1584" w:type="dxa"/>
+            <w:tcW w:w="1077" w:type="dxa"/>
             <w:tcBorders/>
           </w:tcPr>
           <w:p>
@@ -14295,7 +14295,7 @@
         </w:tc>
         <w:tc>
           <w:tcPr>
-            <w:tcW w:w="1584" w:type="dxa"/>
+            <w:tcW w:w="2208" w:type="dxa"/>
             <w:tcBorders/>
           </w:tcPr>
           <w:p>
@@ -14326,7 +14326,7 @@
         </w:tc>
         <w:tc>
           <w:tcPr>
-            <w:tcW w:w="1584" w:type="dxa"/>
+            <w:tcW w:w="2670" w:type="dxa"/>
             <w:tcBorders/>
           </w:tcPr>
           <w:p>
@@ -14360,7 +14360,7 @@
         <w:trPr/>
         <w:tc>
           <w:tcPr>
-            <w:tcW w:w="1584" w:type="dxa"/>
+            <w:tcW w:w="2490" w:type="dxa"/>
             <w:tcBorders/>
           </w:tcPr>
           <w:p>
@@ -14391,7 +14391,7 @@
         </w:tc>
         <w:tc>
           <w:tcPr>
-            <w:tcW w:w="1584" w:type="dxa"/>
+            <w:tcW w:w="1185" w:type="dxa"/>
             <w:tcBorders/>
           </w:tcPr>
           <w:p>
@@ -14422,7 +14422,7 @@
         </w:tc>
         <w:tc>
           <w:tcPr>
-            <w:tcW w:w="1584" w:type="dxa"/>
+            <w:tcW w:w="1077" w:type="dxa"/>
             <w:tcBorders/>
           </w:tcPr>
           <w:p>
@@ -14453,7 +14453,7 @@
         </w:tc>
         <w:tc>
           <w:tcPr>
-            <w:tcW w:w="1584" w:type="dxa"/>
+            <w:tcW w:w="2208" w:type="dxa"/>
             <w:tcBorders/>
           </w:tcPr>
           <w:p>
@@ -14484,7 +14484,7 @@
         </w:tc>
         <w:tc>
           <w:tcPr>
-            <w:tcW w:w="1584" w:type="dxa"/>
+            <w:tcW w:w="2670" w:type="dxa"/>
             <w:tcBorders/>
           </w:tcPr>
           <w:p>
@@ -14518,7 +14518,7 @@
         <w:trPr/>
         <w:tc>
           <w:tcPr>
-            <w:tcW w:w="1584" w:type="dxa"/>
+            <w:tcW w:w="2490" w:type="dxa"/>
             <w:tcBorders/>
           </w:tcPr>
           <w:p>
@@ -14549,7 +14549,7 @@
         </w:tc>
         <w:tc>
           <w:tcPr>
-            <w:tcW w:w="1584" w:type="dxa"/>
+            <w:tcW w:w="1185" w:type="dxa"/>
             <w:tcBorders/>
           </w:tcPr>
           <w:p>
@@ -14580,7 +14580,7 @@
         </w:tc>
         <w:tc>
           <w:tcPr>
-            <w:tcW w:w="1584" w:type="dxa"/>
+            <w:tcW w:w="1077" w:type="dxa"/>
             <w:tcBorders/>
           </w:tcPr>
           <w:p>
@@ -14611,7 +14611,7 @@
         </w:tc>
         <w:tc>
           <w:tcPr>
-            <w:tcW w:w="1584" w:type="dxa"/>
+            <w:tcW w:w="2208" w:type="dxa"/>
             <w:tcBorders/>
           </w:tcPr>
           <w:p>
@@ -14642,7 +14642,7 @@
         </w:tc>
         <w:tc>
           <w:tcPr>
-            <w:tcW w:w="1584" w:type="dxa"/>
+            <w:tcW w:w="2670" w:type="dxa"/>
             <w:tcBorders/>
           </w:tcPr>
           <w:p>
@@ -14676,7 +14676,7 @@
         <w:trPr/>
         <w:tc>
           <w:tcPr>
-            <w:tcW w:w="1584" w:type="dxa"/>
+            <w:tcW w:w="2490" w:type="dxa"/>
             <w:tcBorders/>
           </w:tcPr>
           <w:p>
@@ -14707,7 +14707,7 @@
         </w:tc>
         <w:tc>
           <w:tcPr>
-            <w:tcW w:w="1584" w:type="dxa"/>
+            <w:tcW w:w="1185" w:type="dxa"/>
             <w:tcBorders/>
           </w:tcPr>
           <w:p>
@@ -14738,7 +14738,7 @@
         </w:tc>
         <w:tc>
           <w:tcPr>
-            <w:tcW w:w="1584" w:type="dxa"/>
+            <w:tcW w:w="1077" w:type="dxa"/>
             <w:tcBorders/>
           </w:tcPr>
           <w:p>
@@ -14769,7 +14769,7 @@
         </w:tc>
         <w:tc>
           <w:tcPr>
-            <w:tcW w:w="1584" w:type="dxa"/>
+            <w:tcW w:w="2208" w:type="dxa"/>
             <w:tcBorders/>
           </w:tcPr>
           <w:p>
@@ -14810,7 +14810,7 @@
         </w:tc>
         <w:tc>
           <w:tcPr>
-            <w:tcW w:w="1584" w:type="dxa"/>
+            <w:tcW w:w="2670" w:type="dxa"/>
             <w:tcBorders/>
           </w:tcPr>
           <w:p>
@@ -14854,7 +14854,7 @@
         <w:trPr/>
         <w:tc>
           <w:tcPr>
-            <w:tcW w:w="1584" w:type="dxa"/>
+            <w:tcW w:w="2490" w:type="dxa"/>
             <w:tcBorders/>
           </w:tcPr>
           <w:p>
@@ -14885,7 +14885,7 @@
         </w:tc>
         <w:tc>
           <w:tcPr>
-            <w:tcW w:w="1584" w:type="dxa"/>
+            <w:tcW w:w="1185" w:type="dxa"/>
             <w:tcBorders/>
           </w:tcPr>
           <w:p>
@@ -14916,7 +14916,7 @@
         </w:tc>
         <w:tc>
           <w:tcPr>
-            <w:tcW w:w="1584" w:type="dxa"/>
+            <w:tcW w:w="1077" w:type="dxa"/>
             <w:tcBorders/>
           </w:tcPr>
           <w:p>
@@ -14947,7 +14947,7 @@
         </w:tc>
         <w:tc>
           <w:tcPr>
-            <w:tcW w:w="1584" w:type="dxa"/>
+            <w:tcW w:w="2208" w:type="dxa"/>
             <w:tcBorders/>
           </w:tcPr>
           <w:p>
@@ -14988,7 +14988,7 @@
         </w:tc>
         <w:tc>
           <w:tcPr>
-            <w:tcW w:w="1584" w:type="dxa"/>
+            <w:tcW w:w="2670" w:type="dxa"/>
             <w:tcBorders/>
           </w:tcPr>
           <w:p>
@@ -15022,7 +15022,7 @@
         <w:trPr/>
         <w:tc>
           <w:tcPr>
-            <w:tcW w:w="1584" w:type="dxa"/>
+            <w:tcW w:w="2490" w:type="dxa"/>
             <w:tcBorders/>
           </w:tcPr>
           <w:p>
@@ -15053,7 +15053,7 @@
         </w:tc>
         <w:tc>
           <w:tcPr>
-            <w:tcW w:w="1584" w:type="dxa"/>
+            <w:tcW w:w="1185" w:type="dxa"/>
             <w:tcBorders/>
           </w:tcPr>
           <w:p>
@@ -15084,7 +15084,7 @@
         </w:tc>
         <w:tc>
           <w:tcPr>
-            <w:tcW w:w="1584" w:type="dxa"/>
+            <w:tcW w:w="1077" w:type="dxa"/>
             <w:tcBorders/>
           </w:tcPr>
           <w:p>
@@ -15115,7 +15115,7 @@
         </w:tc>
         <w:tc>
           <w:tcPr>
-            <w:tcW w:w="1584" w:type="dxa"/>
+            <w:tcW w:w="2208" w:type="dxa"/>
             <w:tcBorders/>
           </w:tcPr>
           <w:p>
@@ -15156,7 +15156,7 @@
         </w:tc>
         <w:tc>
           <w:tcPr>
-            <w:tcW w:w="1584" w:type="dxa"/>
+            <w:tcW w:w="2670" w:type="dxa"/>
             <w:tcBorders/>
           </w:tcPr>
           <w:p>
@@ -15190,7 +15190,7 @@
         <w:trPr/>
         <w:tc>
           <w:tcPr>
-            <w:tcW w:w="1584" w:type="dxa"/>
+            <w:tcW w:w="2490" w:type="dxa"/>
             <w:tcBorders/>
           </w:tcPr>
           <w:p>
@@ -15221,7 +15221,7 @@
         </w:tc>
         <w:tc>
           <w:tcPr>
-            <w:tcW w:w="1584" w:type="dxa"/>
+            <w:tcW w:w="1185" w:type="dxa"/>
             <w:tcBorders/>
           </w:tcPr>
           <w:p>
@@ -15252,7 +15252,7 @@
         </w:tc>
         <w:tc>
           <w:tcPr>
-            <w:tcW w:w="1584" w:type="dxa"/>
+            <w:tcW w:w="1077" w:type="dxa"/>
             <w:tcBorders/>
           </w:tcPr>
           <w:p>
@@ -15283,7 +15283,7 @@
         </w:tc>
         <w:tc>
           <w:tcPr>
-            <w:tcW w:w="1584" w:type="dxa"/>
+            <w:tcW w:w="2208" w:type="dxa"/>
             <w:tcBorders/>
           </w:tcPr>
           <w:p>
@@ -15314,7 +15314,7 @@
         </w:tc>
         <w:tc>
           <w:tcPr>
-            <w:tcW w:w="1584" w:type="dxa"/>
+            <w:tcW w:w="2670" w:type="dxa"/>
             <w:tcBorders/>
           </w:tcPr>
           <w:p>
@@ -15348,7 +15348,7 @@
         <w:trPr/>
         <w:tc>
           <w:tcPr>
-            <w:tcW w:w="1584" w:type="dxa"/>
+            <w:tcW w:w="2490" w:type="dxa"/>
             <w:tcBorders/>
           </w:tcPr>
           <w:p>
@@ -15379,7 +15379,7 @@
         </w:tc>
         <w:tc>
           <w:tcPr>
-            <w:tcW w:w="1584" w:type="dxa"/>
+            <w:tcW w:w="1185" w:type="dxa"/>
             <w:tcBorders/>
           </w:tcPr>
           <w:p>
@@ -15410,7 +15410,7 @@
         </w:tc>
         <w:tc>
           <w:tcPr>
-            <w:tcW w:w="1584" w:type="dxa"/>
+            <w:tcW w:w="1077" w:type="dxa"/>
             <w:tcBorders/>
           </w:tcPr>
           <w:p>
@@ -15441,7 +15441,7 @@
         </w:tc>
         <w:tc>
           <w:tcPr>
-            <w:tcW w:w="1584" w:type="dxa"/>
+            <w:tcW w:w="2208" w:type="dxa"/>
             <w:tcBorders/>
           </w:tcPr>
           <w:p>
@@ -15472,7 +15472,7 @@
         </w:tc>
         <w:tc>
           <w:tcPr>
-            <w:tcW w:w="1584" w:type="dxa"/>
+            <w:tcW w:w="2670" w:type="dxa"/>
             <w:tcBorders/>
           </w:tcPr>
           <w:p>
@@ -15506,7 +15506,7 @@
         <w:trPr/>
         <w:tc>
           <w:tcPr>
-            <w:tcW w:w="1584" w:type="dxa"/>
+            <w:tcW w:w="2490" w:type="dxa"/>
             <w:tcBorders/>
           </w:tcPr>
           <w:p>
@@ -15537,7 +15537,7 @@
         </w:tc>
         <w:tc>
           <w:tcPr>
-            <w:tcW w:w="1584" w:type="dxa"/>
+            <w:tcW w:w="1185" w:type="dxa"/>
             <w:tcBorders/>
           </w:tcPr>
           <w:p>
@@ -15568,7 +15568,7 @@
         </w:tc>
         <w:tc>
           <w:tcPr>
-            <w:tcW w:w="1584" w:type="dxa"/>
+            <w:tcW w:w="1077" w:type="dxa"/>
             <w:tcBorders/>
           </w:tcPr>
           <w:p>
@@ -15599,7 +15599,7 @@
         </w:tc>
         <w:tc>
           <w:tcPr>
-            <w:tcW w:w="1584" w:type="dxa"/>
+            <w:tcW w:w="2208" w:type="dxa"/>
             <w:tcBorders/>
           </w:tcPr>
           <w:p>
@@ -15640,7 +15640,7 @@
         </w:tc>
         <w:tc>
           <w:tcPr>
-            <w:tcW w:w="1584" w:type="dxa"/>
+            <w:tcW w:w="2670" w:type="dxa"/>
             <w:tcBorders/>
           </w:tcPr>
           <w:p>
@@ -15674,7 +15674,7 @@
         <w:trPr/>
         <w:tc>
           <w:tcPr>
-            <w:tcW w:w="1584" w:type="dxa"/>
+            <w:tcW w:w="2490" w:type="dxa"/>
             <w:tcBorders/>
           </w:tcPr>
           <w:p>
@@ -15705,7 +15705,7 @@
         </w:tc>
         <w:tc>
           <w:tcPr>
-            <w:tcW w:w="1584" w:type="dxa"/>
+            <w:tcW w:w="1185" w:type="dxa"/>
             <w:tcBorders/>
           </w:tcPr>
           <w:p>
@@ -15736,7 +15736,7 @@
         </w:tc>
         <w:tc>
           <w:tcPr>
-            <w:tcW w:w="1584" w:type="dxa"/>
+            <w:tcW w:w="1077" w:type="dxa"/>
             <w:tcBorders/>
           </w:tcPr>
           <w:p>
@@ -15767,7 +15767,7 @@
         </w:tc>
         <w:tc>
           <w:tcPr>
-            <w:tcW w:w="1584" w:type="dxa"/>
+            <w:tcW w:w="2208" w:type="dxa"/>
             <w:tcBorders/>
           </w:tcPr>
           <w:p>
@@ -15808,7 +15808,7 @@
         </w:tc>
         <w:tc>
           <w:tcPr>
-            <w:tcW w:w="1584" w:type="dxa"/>
+            <w:tcW w:w="2670" w:type="dxa"/>
             <w:tcBorders/>
           </w:tcPr>
           <w:p>
@@ -15842,7 +15842,7 @@
         <w:trPr/>
         <w:tc>
           <w:tcPr>
-            <w:tcW w:w="1584" w:type="dxa"/>
+            <w:tcW w:w="2490" w:type="dxa"/>
             <w:tcBorders/>
           </w:tcPr>
           <w:p>
@@ -15873,7 +15873,7 @@
         </w:tc>
         <w:tc>
           <w:tcPr>
-            <w:tcW w:w="1584" w:type="dxa"/>
+            <w:tcW w:w="1185" w:type="dxa"/>
             <w:tcBorders/>
           </w:tcPr>
           <w:p>
@@ -15904,7 +15904,7 @@
         </w:tc>
         <w:tc>
           <w:tcPr>
-            <w:tcW w:w="1584" w:type="dxa"/>
+            <w:tcW w:w="1077" w:type="dxa"/>
             <w:tcBorders/>
           </w:tcPr>
           <w:p>
@@ -15935,7 +15935,7 @@
         </w:tc>
         <w:tc>
           <w:tcPr>
-            <w:tcW w:w="1584" w:type="dxa"/>
+            <w:tcW w:w="2208" w:type="dxa"/>
             <w:tcBorders/>
           </w:tcPr>
           <w:p>
@@ -15966,7 +15966,7 @@
         </w:tc>
         <w:tc>
           <w:tcPr>
-            <w:tcW w:w="1584" w:type="dxa"/>
+            <w:tcW w:w="2670" w:type="dxa"/>
             <w:tcBorders/>
           </w:tcPr>
           <w:p>
@@ -16000,7 +16000,7 @@
         <w:trPr/>
         <w:tc>
           <w:tcPr>
-            <w:tcW w:w="1584" w:type="dxa"/>
+            <w:tcW w:w="2490" w:type="dxa"/>
             <w:tcBorders/>
           </w:tcPr>
           <w:p>
@@ -16031,7 +16031,7 @@
         </w:tc>
         <w:tc>
           <w:tcPr>
-            <w:tcW w:w="1584" w:type="dxa"/>
+            <w:tcW w:w="1185" w:type="dxa"/>
             <w:tcBorders/>
           </w:tcPr>
           <w:p>
@@ -16062,7 +16062,7 @@
         </w:tc>
         <w:tc>
           <w:tcPr>
-            <w:tcW w:w="1584" w:type="dxa"/>
+            <w:tcW w:w="1077" w:type="dxa"/>
             <w:tcBorders/>
           </w:tcPr>
           <w:p>
@@ -16093,7 +16093,7 @@
         </w:tc>
         <w:tc>
           <w:tcPr>
-            <w:tcW w:w="1584" w:type="dxa"/>
+            <w:tcW w:w="2208" w:type="dxa"/>
             <w:tcBorders/>
           </w:tcPr>
           <w:p>
@@ -16124,7 +16124,7 @@
         </w:tc>
         <w:tc>
           <w:tcPr>
-            <w:tcW w:w="1584" w:type="dxa"/>
+            <w:tcW w:w="2670" w:type="dxa"/>
             <w:tcBorders/>
           </w:tcPr>
           <w:p>
@@ -16158,7 +16158,7 @@
         <w:trPr/>
         <w:tc>
           <w:tcPr>
-            <w:tcW w:w="1584" w:type="dxa"/>
+            <w:tcW w:w="2490" w:type="dxa"/>
             <w:tcBorders/>
           </w:tcPr>
           <w:p>
@@ -16189,7 +16189,7 @@
         </w:tc>
         <w:tc>
           <w:tcPr>
-            <w:tcW w:w="1584" w:type="dxa"/>
+            <w:tcW w:w="1185" w:type="dxa"/>
             <w:tcBorders/>
           </w:tcPr>
           <w:p>
@@ -16220,7 +16220,7 @@
         </w:tc>
         <w:tc>
           <w:tcPr>
-            <w:tcW w:w="1584" w:type="dxa"/>
+            <w:tcW w:w="1077" w:type="dxa"/>
             <w:tcBorders/>
           </w:tcPr>
           <w:p>
@@ -16251,7 +16251,7 @@
         </w:tc>
         <w:tc>
           <w:tcPr>
-            <w:tcW w:w="1584" w:type="dxa"/>
+            <w:tcW w:w="2208" w:type="dxa"/>
             <w:tcBorders/>
           </w:tcPr>
           <w:p>
@@ -16282,7 +16282,7 @@
         </w:tc>
         <w:tc>
           <w:tcPr>
-            <w:tcW w:w="1584" w:type="dxa"/>
+            <w:tcW w:w="2670" w:type="dxa"/>
             <w:tcBorders/>
           </w:tcPr>
           <w:p>
@@ -16316,7 +16316,7 @@
         <w:trPr/>
         <w:tc>
           <w:tcPr>
-            <w:tcW w:w="1584" w:type="dxa"/>
+            <w:tcW w:w="2490" w:type="dxa"/>
             <w:tcBorders/>
           </w:tcPr>
           <w:p>
@@ -16347,7 +16347,7 @@
         </w:tc>
         <w:tc>
           <w:tcPr>
-            <w:tcW w:w="1584" w:type="dxa"/>
+            <w:tcW w:w="1185" w:type="dxa"/>
             <w:tcBorders/>
           </w:tcPr>
           <w:p>
@@ -16378,7 +16378,7 @@
         </w:tc>
         <w:tc>
           <w:tcPr>
-            <w:tcW w:w="1584" w:type="dxa"/>
+            <w:tcW w:w="1077" w:type="dxa"/>
             <w:tcBorders/>
           </w:tcPr>
           <w:p>
@@ -16409,7 +16409,7 @@
         </w:tc>
         <w:tc>
           <w:tcPr>
-            <w:tcW w:w="1584" w:type="dxa"/>
+            <w:tcW w:w="2208" w:type="dxa"/>
             <w:tcBorders/>
           </w:tcPr>
           <w:p>
@@ -16440,7 +16440,7 @@
         </w:tc>
         <w:tc>
           <w:tcPr>
-            <w:tcW w:w="1584" w:type="dxa"/>
+            <w:tcW w:w="2670" w:type="dxa"/>
             <w:tcBorders/>
           </w:tcPr>
           <w:p>
@@ -16474,7 +16474,7 @@
         <w:trPr/>
         <w:tc>
           <w:tcPr>
-            <w:tcW w:w="1584" w:type="dxa"/>
+            <w:tcW w:w="2490" w:type="dxa"/>
             <w:tcBorders/>
           </w:tcPr>
           <w:p>
@@ -16505,7 +16505,7 @@
         </w:tc>
         <w:tc>
           <w:tcPr>
-            <w:tcW w:w="1584" w:type="dxa"/>
+            <w:tcW w:w="1185" w:type="dxa"/>
             <w:tcBorders/>
           </w:tcPr>
           <w:p>
@@ -16536,67 +16536,67 @@
         </w:tc>
         <w:tc>
           <w:tcPr>
-            <w:tcW w:w="1584" w:type="dxa"/>
-            <w:tcBorders/>
-          </w:tcPr>
-          <w:p>
-            <w:pPr>
-              <w:pStyle w:val="Compact"/>
-              <w:widowControl/>
-              <w:spacing w:before="36" w:after="36"/>
-              <w:jc w:val="left"/>
-              <w:rPr>
-                <w:rFonts w:ascii="Cambria" w:hAnsi="Cambria" w:eastAsia="Cambria" w:cs=""/>
-                <w:kern w:val="0"/>
-                <w:sz w:val="24"/>
-                <w:szCs w:val="24"/>
-                <w:lang w:val="en-US" w:eastAsia="en-US" w:bidi="ar-SA"/>
-              </w:rPr>
-            </w:pPr>
-            <w:r>
-              <w:rPr>
-                <w:rFonts w:eastAsia="Cambria" w:cs=""/>
-                <w:kern w:val="0"/>
-                <w:sz w:val="24"/>
-                <w:szCs w:val="24"/>
-                <w:lang w:val="en-US" w:eastAsia="en-US" w:bidi="ar-SA"/>
-              </w:rPr>
-            </w:r>
-          </w:p>
-        </w:tc>
-        <w:tc>
-          <w:tcPr>
-            <w:tcW w:w="1584" w:type="dxa"/>
-            <w:tcBorders/>
-          </w:tcPr>
-          <w:p>
-            <w:pPr>
-              <w:pStyle w:val="Compact"/>
-              <w:widowControl/>
-              <w:spacing w:before="36" w:after="36"/>
-              <w:jc w:val="left"/>
-              <w:rPr>
-                <w:rFonts w:ascii="Cambria" w:hAnsi="Cambria" w:eastAsia="Cambria" w:cs=""/>
-                <w:kern w:val="0"/>
-                <w:sz w:val="24"/>
-                <w:szCs w:val="24"/>
-                <w:lang w:val="en-US" w:eastAsia="en-US" w:bidi="ar-SA"/>
-              </w:rPr>
-            </w:pPr>
-            <w:r>
-              <w:rPr>
-                <w:rFonts w:eastAsia="Cambria" w:cs=""/>
-                <w:kern w:val="0"/>
-                <w:sz w:val="24"/>
-                <w:szCs w:val="24"/>
-                <w:lang w:val="en-US" w:eastAsia="en-US" w:bidi="ar-SA"/>
-              </w:rPr>
-            </w:r>
-          </w:p>
-        </w:tc>
-        <w:tc>
-          <w:tcPr>
-            <w:tcW w:w="1584" w:type="dxa"/>
+            <w:tcW w:w="1077" w:type="dxa"/>
+            <w:tcBorders/>
+          </w:tcPr>
+          <w:p>
+            <w:pPr>
+              <w:pStyle w:val="Compact"/>
+              <w:widowControl/>
+              <w:spacing w:before="36" w:after="36"/>
+              <w:jc w:val="left"/>
+              <w:rPr>
+                <w:rFonts w:ascii="Cambria" w:hAnsi="Cambria" w:eastAsia="Cambria" w:cs=""/>
+                <w:kern w:val="0"/>
+                <w:sz w:val="24"/>
+                <w:szCs w:val="24"/>
+                <w:lang w:val="en-US" w:eastAsia="en-US" w:bidi="ar-SA"/>
+              </w:rPr>
+            </w:pPr>
+            <w:r>
+              <w:rPr>
+                <w:rFonts w:eastAsia="Cambria" w:cs=""/>
+                <w:kern w:val="0"/>
+                <w:sz w:val="24"/>
+                <w:szCs w:val="24"/>
+                <w:lang w:val="en-US" w:eastAsia="en-US" w:bidi="ar-SA"/>
+              </w:rPr>
+            </w:r>
+          </w:p>
+        </w:tc>
+        <w:tc>
+          <w:tcPr>
+            <w:tcW w:w="2208" w:type="dxa"/>
+            <w:tcBorders/>
+          </w:tcPr>
+          <w:p>
+            <w:pPr>
+              <w:pStyle w:val="Compact"/>
+              <w:widowControl/>
+              <w:spacing w:before="36" w:after="36"/>
+              <w:jc w:val="left"/>
+              <w:rPr>
+                <w:rFonts w:ascii="Cambria" w:hAnsi="Cambria" w:eastAsia="Cambria" w:cs=""/>
+                <w:kern w:val="0"/>
+                <w:sz w:val="24"/>
+                <w:szCs w:val="24"/>
+                <w:lang w:val="en-US" w:eastAsia="en-US" w:bidi="ar-SA"/>
+              </w:rPr>
+            </w:pPr>
+            <w:r>
+              <w:rPr>
+                <w:rFonts w:eastAsia="Cambria" w:cs=""/>
+                <w:kern w:val="0"/>
+                <w:sz w:val="24"/>
+                <w:szCs w:val="24"/>
+                <w:lang w:val="en-US" w:eastAsia="en-US" w:bidi="ar-SA"/>
+              </w:rPr>
+            </w:r>
+          </w:p>
+        </w:tc>
+        <w:tc>
+          <w:tcPr>
+            <w:tcW w:w="2670" w:type="dxa"/>
             <w:tcBorders/>
           </w:tcPr>
           <w:p>
@@ -17055,7 +17055,7 @@
     <w:tbl>
       <w:tblPr>
         <w:tblStyle w:val="Table"/>
-        <w:tblW w:w="7920" w:type="dxa"/>
+        <w:tblW w:w="9630" w:type="dxa"/>
         <w:jc w:val="left"/>
         <w:tblInd w:w="108" w:type="dxa"/>
         <w:tblLayout w:type="fixed"/>
@@ -17070,7 +17070,7 @@
       <w:tblGrid>
         <w:gridCol w:w="2640"/>
         <w:gridCol w:w="2640"/>
-        <w:gridCol w:w="2640"/>
+        <w:gridCol w:w="4350"/>
       </w:tblGrid>
       <w:tr>
         <w:trPr>
@@ -17146,7 +17146,7 @@
         </w:tc>
         <w:tc>
           <w:tcPr>
-            <w:tcW w:w="2640" w:type="dxa"/>
+            <w:tcW w:w="4350" w:type="dxa"/>
             <w:tcBorders>
               <w:bottom w:val="single" w:sz="6" w:space="0" w:color="000000"/>
             </w:tcBorders>
@@ -17245,7 +17245,7 @@
         </w:tc>
         <w:tc>
           <w:tcPr>
-            <w:tcW w:w="2640" w:type="dxa"/>
+            <w:tcW w:w="4350" w:type="dxa"/>
             <w:tcBorders/>
           </w:tcPr>
           <w:p>
@@ -17341,7 +17341,7 @@
         </w:tc>
         <w:tc>
           <w:tcPr>
-            <w:tcW w:w="2640" w:type="dxa"/>
+            <w:tcW w:w="4350" w:type="dxa"/>
             <w:tcBorders/>
           </w:tcPr>
           <w:p>
@@ -17437,7 +17437,7 @@
         </w:tc>
         <w:tc>
           <w:tcPr>
-            <w:tcW w:w="2640" w:type="dxa"/>
+            <w:tcW w:w="4350" w:type="dxa"/>
             <w:tcBorders/>
           </w:tcPr>
           <w:p>
@@ -17533,7 +17533,7 @@
         </w:tc>
         <w:tc>
           <w:tcPr>
-            <w:tcW w:w="2640" w:type="dxa"/>
+            <w:tcW w:w="4350" w:type="dxa"/>
             <w:tcBorders/>
           </w:tcPr>
           <w:p>
@@ -17629,7 +17629,7 @@
         </w:tc>
         <w:tc>
           <w:tcPr>
-            <w:tcW w:w="2640" w:type="dxa"/>
+            <w:tcW w:w="4350" w:type="dxa"/>
             <w:tcBorders/>
           </w:tcPr>
           <w:p>
@@ -17725,7 +17725,7 @@
         </w:tc>
         <w:tc>
           <w:tcPr>
-            <w:tcW w:w="2640" w:type="dxa"/>
+            <w:tcW w:w="4350" w:type="dxa"/>
             <w:tcBorders/>
           </w:tcPr>
           <w:p>
@@ -17821,7 +17821,7 @@
         </w:tc>
         <w:tc>
           <w:tcPr>
-            <w:tcW w:w="2640" w:type="dxa"/>
+            <w:tcW w:w="4350" w:type="dxa"/>
             <w:tcBorders/>
           </w:tcPr>
           <w:p>
@@ -17917,7 +17917,7 @@
         </w:tc>
         <w:tc>
           <w:tcPr>
-            <w:tcW w:w="2640" w:type="dxa"/>
+            <w:tcW w:w="4350" w:type="dxa"/>
             <w:tcBorders/>
           </w:tcPr>
           <w:p>
@@ -19485,7 +19485,7 @@
     <w:tbl>
       <w:tblPr>
         <w:tblStyle w:val="Table"/>
-        <w:tblW w:w="7920" w:type="dxa"/>
+        <w:tblW w:w="14565" w:type="dxa"/>
         <w:jc w:val="left"/>
         <w:tblInd w:w="108" w:type="dxa"/>
         <w:tblLayout w:type="fixed"/>
@@ -19498,15 +19498,15 @@
         <w:tblLook w:val="0020" w:noHBand="0" w:noVBand="0" w:firstColumn="0" w:lastRow="0" w:lastColumn="0" w:firstRow="1"/>
       </w:tblPr>
       <w:tblGrid>
-        <w:gridCol w:w="879"/>
-        <w:gridCol w:w="880"/>
-        <w:gridCol w:w="880"/>
-        <w:gridCol w:w="880"/>
-        <w:gridCol w:w="881"/>
-        <w:gridCol w:w="880"/>
-        <w:gridCol w:w="880"/>
-        <w:gridCol w:w="880"/>
-        <w:gridCol w:w="879"/>
+        <w:gridCol w:w="3060"/>
+        <w:gridCol w:w="1185"/>
+        <w:gridCol w:w="675"/>
+        <w:gridCol w:w="2100"/>
+        <w:gridCol w:w="2160"/>
+        <w:gridCol w:w="1080"/>
+        <w:gridCol w:w="960"/>
+        <w:gridCol w:w="1755"/>
+        <w:gridCol w:w="1590"/>
       </w:tblGrid>
       <w:tr>
         <w:trPr>
@@ -19514,7 +19514,7 @@
         </w:trPr>
         <w:tc>
           <w:tcPr>
-            <w:tcW w:w="879" w:type="dxa"/>
+            <w:tcW w:w="3060" w:type="dxa"/>
             <w:tcBorders>
               <w:bottom w:val="single" w:sz="6" w:space="0" w:color="000000"/>
             </w:tcBorders>
@@ -19548,7 +19548,7 @@
         </w:tc>
         <w:tc>
           <w:tcPr>
-            <w:tcW w:w="880" w:type="dxa"/>
+            <w:tcW w:w="1185" w:type="dxa"/>
             <w:tcBorders>
               <w:bottom w:val="single" w:sz="6" w:space="0" w:color="000000"/>
             </w:tcBorders>
@@ -19582,7 +19582,7 @@
         </w:tc>
         <w:tc>
           <w:tcPr>
-            <w:tcW w:w="880" w:type="dxa"/>
+            <w:tcW w:w="675" w:type="dxa"/>
             <w:tcBorders>
               <w:bottom w:val="single" w:sz="6" w:space="0" w:color="000000"/>
             </w:tcBorders>
@@ -19616,7 +19616,7 @@
         </w:tc>
         <w:tc>
           <w:tcPr>
-            <w:tcW w:w="880" w:type="dxa"/>
+            <w:tcW w:w="2100" w:type="dxa"/>
             <w:tcBorders>
               <w:bottom w:val="single" w:sz="6" w:space="0" w:color="000000"/>
             </w:tcBorders>
@@ -19650,7 +19650,7 @@
         </w:tc>
         <w:tc>
           <w:tcPr>
-            <w:tcW w:w="881" w:type="dxa"/>
+            <w:tcW w:w="2160" w:type="dxa"/>
             <w:tcBorders>
               <w:bottom w:val="single" w:sz="6" w:space="0" w:color="000000"/>
             </w:tcBorders>
@@ -19684,7 +19684,7 @@
         </w:tc>
         <w:tc>
           <w:tcPr>
-            <w:tcW w:w="880" w:type="dxa"/>
+            <w:tcW w:w="1080" w:type="dxa"/>
             <w:tcBorders>
               <w:bottom w:val="single" w:sz="6" w:space="0" w:color="000000"/>
             </w:tcBorders>
@@ -19718,7 +19718,7 @@
         </w:tc>
         <w:tc>
           <w:tcPr>
-            <w:tcW w:w="880" w:type="dxa"/>
+            <w:tcW w:w="960" w:type="dxa"/>
             <w:tcBorders>
               <w:bottom w:val="single" w:sz="6" w:space="0" w:color="000000"/>
             </w:tcBorders>
@@ -19752,7 +19752,7 @@
         </w:tc>
         <w:tc>
           <w:tcPr>
-            <w:tcW w:w="880" w:type="dxa"/>
+            <w:tcW w:w="1755" w:type="dxa"/>
             <w:tcBorders>
               <w:bottom w:val="single" w:sz="6" w:space="0" w:color="000000"/>
             </w:tcBorders>
@@ -19786,7 +19786,7 @@
         </w:tc>
         <w:tc>
           <w:tcPr>
-            <w:tcW w:w="879" w:type="dxa"/>
+            <w:tcW w:w="1590" w:type="dxa"/>
             <w:tcBorders>
               <w:bottom w:val="single" w:sz="6" w:space="0" w:color="000000"/>
             </w:tcBorders>
@@ -19823,7 +19823,7 @@
         <w:trPr/>
         <w:tc>
           <w:tcPr>
-            <w:tcW w:w="879" w:type="dxa"/>
+            <w:tcW w:w="3060" w:type="dxa"/>
             <w:tcBorders/>
           </w:tcPr>
           <w:p>
@@ -19854,7 +19854,7 @@
         </w:tc>
         <w:tc>
           <w:tcPr>
-            <w:tcW w:w="880" w:type="dxa"/>
+            <w:tcW w:w="1185" w:type="dxa"/>
             <w:tcBorders/>
           </w:tcPr>
           <w:p>
@@ -19885,7 +19885,7 @@
         </w:tc>
         <w:tc>
           <w:tcPr>
-            <w:tcW w:w="880" w:type="dxa"/>
+            <w:tcW w:w="675" w:type="dxa"/>
             <w:tcBorders/>
           </w:tcPr>
           <w:p>
@@ -19916,7 +19916,7 @@
         </w:tc>
         <w:tc>
           <w:tcPr>
-            <w:tcW w:w="880" w:type="dxa"/>
+            <w:tcW w:w="2100" w:type="dxa"/>
             <w:tcBorders/>
           </w:tcPr>
           <w:p>
@@ -19959,7 +19959,7 @@
         </w:tc>
         <w:tc>
           <w:tcPr>
-            <w:tcW w:w="881" w:type="dxa"/>
+            <w:tcW w:w="2160" w:type="dxa"/>
             <w:tcBorders/>
           </w:tcPr>
           <w:p>
@@ -19990,7 +19990,7 @@
         </w:tc>
         <w:tc>
           <w:tcPr>
-            <w:tcW w:w="880" w:type="dxa"/>
+            <w:tcW w:w="1080" w:type="dxa"/>
             <w:tcBorders/>
           </w:tcPr>
           <w:p>
@@ -20021,7 +20021,7 @@
         </w:tc>
         <w:tc>
           <w:tcPr>
-            <w:tcW w:w="880" w:type="dxa"/>
+            <w:tcW w:w="960" w:type="dxa"/>
             <w:tcBorders/>
           </w:tcPr>
           <w:p>
@@ -20052,7 +20052,7 @@
         </w:tc>
         <w:tc>
           <w:tcPr>
-            <w:tcW w:w="880" w:type="dxa"/>
+            <w:tcW w:w="1755" w:type="dxa"/>
             <w:tcBorders/>
           </w:tcPr>
           <w:p>
@@ -20083,7 +20083,7 @@
         </w:tc>
         <w:tc>
           <w:tcPr>
-            <w:tcW w:w="879" w:type="dxa"/>
+            <w:tcW w:w="1590" w:type="dxa"/>
             <w:tcBorders/>
           </w:tcPr>
           <w:p>
@@ -20127,7 +20127,7 @@
         <w:trPr/>
         <w:tc>
           <w:tcPr>
-            <w:tcW w:w="879" w:type="dxa"/>
+            <w:tcW w:w="3060" w:type="dxa"/>
             <w:tcBorders/>
           </w:tcPr>
           <w:p>
@@ -20158,7 +20158,7 @@
         </w:tc>
         <w:tc>
           <w:tcPr>
-            <w:tcW w:w="880" w:type="dxa"/>
+            <w:tcW w:w="1185" w:type="dxa"/>
             <w:tcBorders/>
           </w:tcPr>
           <w:p>
@@ -20189,7 +20189,7 @@
         </w:tc>
         <w:tc>
           <w:tcPr>
-            <w:tcW w:w="880" w:type="dxa"/>
+            <w:tcW w:w="675" w:type="dxa"/>
             <w:tcBorders/>
           </w:tcPr>
           <w:p>
@@ -20220,7 +20220,7 @@
         </w:tc>
         <w:tc>
           <w:tcPr>
-            <w:tcW w:w="880" w:type="dxa"/>
+            <w:tcW w:w="2100" w:type="dxa"/>
             <w:tcBorders/>
           </w:tcPr>
           <w:p>
@@ -20263,7 +20263,7 @@
         </w:tc>
         <w:tc>
           <w:tcPr>
-            <w:tcW w:w="881" w:type="dxa"/>
+            <w:tcW w:w="2160" w:type="dxa"/>
             <w:tcBorders/>
           </w:tcPr>
           <w:p>
@@ -20294,7 +20294,7 @@
         </w:tc>
         <w:tc>
           <w:tcPr>
-            <w:tcW w:w="880" w:type="dxa"/>
+            <w:tcW w:w="1080" w:type="dxa"/>
             <w:tcBorders/>
           </w:tcPr>
           <w:p>
@@ -20325,7 +20325,7 @@
         </w:tc>
         <w:tc>
           <w:tcPr>
-            <w:tcW w:w="880" w:type="dxa"/>
+            <w:tcW w:w="960" w:type="dxa"/>
             <w:tcBorders/>
           </w:tcPr>
           <w:p>
@@ -20356,7 +20356,7 @@
         </w:tc>
         <w:tc>
           <w:tcPr>
-            <w:tcW w:w="880" w:type="dxa"/>
+            <w:tcW w:w="1755" w:type="dxa"/>
             <w:tcBorders/>
           </w:tcPr>
           <w:p>
@@ -20387,7 +20387,7 @@
         </w:tc>
         <w:tc>
           <w:tcPr>
-            <w:tcW w:w="879" w:type="dxa"/>
+            <w:tcW w:w="1590" w:type="dxa"/>
             <w:tcBorders/>
           </w:tcPr>
           <w:p>
@@ -20421,7 +20421,7 @@
         <w:trPr/>
         <w:tc>
           <w:tcPr>
-            <w:tcW w:w="879" w:type="dxa"/>
+            <w:tcW w:w="3060" w:type="dxa"/>
             <w:tcBorders/>
           </w:tcPr>
           <w:p>
@@ -20452,7 +20452,7 @@
         </w:tc>
         <w:tc>
           <w:tcPr>
-            <w:tcW w:w="880" w:type="dxa"/>
+            <w:tcW w:w="1185" w:type="dxa"/>
             <w:tcBorders/>
           </w:tcPr>
           <w:p>
@@ -20483,7 +20483,7 @@
         </w:tc>
         <w:tc>
           <w:tcPr>
-            <w:tcW w:w="880" w:type="dxa"/>
+            <w:tcW w:w="675" w:type="dxa"/>
             <w:tcBorders/>
           </w:tcPr>
           <w:p>
@@ -20514,7 +20514,7 @@
         </w:tc>
         <w:tc>
           <w:tcPr>
-            <w:tcW w:w="880" w:type="dxa"/>
+            <w:tcW w:w="2100" w:type="dxa"/>
             <w:tcBorders/>
           </w:tcPr>
           <w:p>
@@ -20557,7 +20557,7 @@
         </w:tc>
         <w:tc>
           <w:tcPr>
-            <w:tcW w:w="881" w:type="dxa"/>
+            <w:tcW w:w="2160" w:type="dxa"/>
             <w:tcBorders/>
           </w:tcPr>
           <w:p>
@@ -20588,7 +20588,7 @@
         </w:tc>
         <w:tc>
           <w:tcPr>
-            <w:tcW w:w="880" w:type="dxa"/>
+            <w:tcW w:w="1080" w:type="dxa"/>
             <w:tcBorders/>
           </w:tcPr>
           <w:p>
@@ -20619,7 +20619,7 @@
         </w:tc>
         <w:tc>
           <w:tcPr>
-            <w:tcW w:w="880" w:type="dxa"/>
+            <w:tcW w:w="960" w:type="dxa"/>
             <w:tcBorders/>
           </w:tcPr>
           <w:p>
@@ -20650,7 +20650,7 @@
         </w:tc>
         <w:tc>
           <w:tcPr>
-            <w:tcW w:w="880" w:type="dxa"/>
+            <w:tcW w:w="1755" w:type="dxa"/>
             <w:tcBorders/>
           </w:tcPr>
           <w:p>
@@ -20681,7 +20681,7 @@
         </w:tc>
         <w:tc>
           <w:tcPr>
-            <w:tcW w:w="879" w:type="dxa"/>
+            <w:tcW w:w="1590" w:type="dxa"/>
             <w:tcBorders/>
           </w:tcPr>
           <w:p>
@@ -20725,7 +20725,7 @@
         <w:trPr/>
         <w:tc>
           <w:tcPr>
-            <w:tcW w:w="879" w:type="dxa"/>
+            <w:tcW w:w="3060" w:type="dxa"/>
             <w:tcBorders/>
           </w:tcPr>
           <w:p>
@@ -20756,7 +20756,7 @@
         </w:tc>
         <w:tc>
           <w:tcPr>
-            <w:tcW w:w="880" w:type="dxa"/>
+            <w:tcW w:w="1185" w:type="dxa"/>
             <w:tcBorders/>
           </w:tcPr>
           <w:p>
@@ -20787,7 +20787,7 @@
         </w:tc>
         <w:tc>
           <w:tcPr>
-            <w:tcW w:w="880" w:type="dxa"/>
+            <w:tcW w:w="675" w:type="dxa"/>
             <w:tcBorders/>
           </w:tcPr>
           <w:p>
@@ -20818,7 +20818,7 @@
         </w:tc>
         <w:tc>
           <w:tcPr>
-            <w:tcW w:w="880" w:type="dxa"/>
+            <w:tcW w:w="2100" w:type="dxa"/>
             <w:tcBorders/>
           </w:tcPr>
           <w:p>
@@ -20861,7 +20861,7 @@
         </w:tc>
         <w:tc>
           <w:tcPr>
-            <w:tcW w:w="881" w:type="dxa"/>
+            <w:tcW w:w="2160" w:type="dxa"/>
             <w:tcBorders/>
           </w:tcPr>
           <w:p>
@@ -20892,7 +20892,7 @@
         </w:tc>
         <w:tc>
           <w:tcPr>
-            <w:tcW w:w="880" w:type="dxa"/>
+            <w:tcW w:w="1080" w:type="dxa"/>
             <w:tcBorders/>
           </w:tcPr>
           <w:p>
@@ -20923,7 +20923,7 @@
         </w:tc>
         <w:tc>
           <w:tcPr>
-            <w:tcW w:w="880" w:type="dxa"/>
+            <w:tcW w:w="960" w:type="dxa"/>
             <w:tcBorders/>
           </w:tcPr>
           <w:p>
@@ -20954,7 +20954,7 @@
         </w:tc>
         <w:tc>
           <w:tcPr>
-            <w:tcW w:w="880" w:type="dxa"/>
+            <w:tcW w:w="1755" w:type="dxa"/>
             <w:tcBorders/>
           </w:tcPr>
           <w:p>
@@ -20985,7 +20985,7 @@
         </w:tc>
         <w:tc>
           <w:tcPr>
-            <w:tcW w:w="879" w:type="dxa"/>
+            <w:tcW w:w="1590" w:type="dxa"/>
             <w:tcBorders/>
           </w:tcPr>
           <w:p>
@@ -21029,7 +21029,7 @@
         <w:trPr/>
         <w:tc>
           <w:tcPr>
-            <w:tcW w:w="879" w:type="dxa"/>
+            <w:tcW w:w="3060" w:type="dxa"/>
             <w:tcBorders/>
           </w:tcPr>
           <w:p>
@@ -21060,7 +21060,7 @@
         </w:tc>
         <w:tc>
           <w:tcPr>
-            <w:tcW w:w="880" w:type="dxa"/>
+            <w:tcW w:w="1185" w:type="dxa"/>
             <w:tcBorders/>
           </w:tcPr>
           <w:p>
@@ -21091,7 +21091,7 @@
         </w:tc>
         <w:tc>
           <w:tcPr>
-            <w:tcW w:w="880" w:type="dxa"/>
+            <w:tcW w:w="675" w:type="dxa"/>
             <w:tcBorders/>
           </w:tcPr>
           <w:p>
@@ -21122,7 +21122,7 @@
         </w:tc>
         <w:tc>
           <w:tcPr>
-            <w:tcW w:w="880" w:type="dxa"/>
+            <w:tcW w:w="2100" w:type="dxa"/>
             <w:tcBorders/>
           </w:tcPr>
           <w:p>
@@ -21153,7 +21153,7 @@
         </w:tc>
         <w:tc>
           <w:tcPr>
-            <w:tcW w:w="881" w:type="dxa"/>
+            <w:tcW w:w="2160" w:type="dxa"/>
             <w:tcBorders/>
           </w:tcPr>
           <w:p>
@@ -21184,7 +21184,7 @@
         </w:tc>
         <w:tc>
           <w:tcPr>
-            <w:tcW w:w="880" w:type="dxa"/>
+            <w:tcW w:w="1080" w:type="dxa"/>
             <w:tcBorders/>
           </w:tcPr>
           <w:p>
@@ -21215,7 +21215,7 @@
         </w:tc>
         <w:tc>
           <w:tcPr>
-            <w:tcW w:w="880" w:type="dxa"/>
+            <w:tcW w:w="960" w:type="dxa"/>
             <w:tcBorders/>
           </w:tcPr>
           <w:p>
@@ -21246,7 +21246,7 @@
         </w:tc>
         <w:tc>
           <w:tcPr>
-            <w:tcW w:w="880" w:type="dxa"/>
+            <w:tcW w:w="1755" w:type="dxa"/>
             <w:tcBorders/>
           </w:tcPr>
           <w:p>
@@ -21277,7 +21277,7 @@
         </w:tc>
         <w:tc>
           <w:tcPr>
-            <w:tcW w:w="879" w:type="dxa"/>
+            <w:tcW w:w="1590" w:type="dxa"/>
             <w:tcBorders/>
           </w:tcPr>
           <w:p>
@@ -21321,7 +21321,7 @@
         <w:trPr/>
         <w:tc>
           <w:tcPr>
-            <w:tcW w:w="879" w:type="dxa"/>
+            <w:tcW w:w="3060" w:type="dxa"/>
             <w:tcBorders/>
           </w:tcPr>
           <w:p>
@@ -21352,7 +21352,7 @@
         </w:tc>
         <w:tc>
           <w:tcPr>
-            <w:tcW w:w="880" w:type="dxa"/>
+            <w:tcW w:w="1185" w:type="dxa"/>
             <w:tcBorders/>
           </w:tcPr>
           <w:p>
@@ -21383,7 +21383,7 @@
         </w:tc>
         <w:tc>
           <w:tcPr>
-            <w:tcW w:w="880" w:type="dxa"/>
+            <w:tcW w:w="675" w:type="dxa"/>
             <w:tcBorders/>
           </w:tcPr>
           <w:p>
@@ -21414,7 +21414,7 @@
         </w:tc>
         <w:tc>
           <w:tcPr>
-            <w:tcW w:w="880" w:type="dxa"/>
+            <w:tcW w:w="2100" w:type="dxa"/>
             <w:tcBorders/>
           </w:tcPr>
           <w:p>
@@ -21445,7 +21445,7 @@
         </w:tc>
         <w:tc>
           <w:tcPr>
-            <w:tcW w:w="881" w:type="dxa"/>
+            <w:tcW w:w="2160" w:type="dxa"/>
             <w:tcBorders/>
           </w:tcPr>
           <w:p>
@@ -21488,7 +21488,7 @@
         </w:tc>
         <w:tc>
           <w:tcPr>
-            <w:tcW w:w="880" w:type="dxa"/>
+            <w:tcW w:w="1080" w:type="dxa"/>
             <w:tcBorders/>
           </w:tcPr>
           <w:p>
@@ -21519,7 +21519,7 @@
         </w:tc>
         <w:tc>
           <w:tcPr>
-            <w:tcW w:w="880" w:type="dxa"/>
+            <w:tcW w:w="960" w:type="dxa"/>
             <w:tcBorders/>
           </w:tcPr>
           <w:p>
@@ -21550,7 +21550,7 @@
         </w:tc>
         <w:tc>
           <w:tcPr>
-            <w:tcW w:w="880" w:type="dxa"/>
+            <w:tcW w:w="1755" w:type="dxa"/>
             <w:tcBorders/>
           </w:tcPr>
           <w:p>
@@ -21581,7 +21581,7 @@
         </w:tc>
         <w:tc>
           <w:tcPr>
-            <w:tcW w:w="879" w:type="dxa"/>
+            <w:tcW w:w="1590" w:type="dxa"/>
             <w:tcBorders/>
           </w:tcPr>
           <w:p>
@@ -21625,7 +21625,7 @@
         <w:trPr/>
         <w:tc>
           <w:tcPr>
-            <w:tcW w:w="879" w:type="dxa"/>
+            <w:tcW w:w="3060" w:type="dxa"/>
             <w:tcBorders/>
           </w:tcPr>
           <w:p>
@@ -21656,7 +21656,7 @@
         </w:tc>
         <w:tc>
           <w:tcPr>
-            <w:tcW w:w="880" w:type="dxa"/>
+            <w:tcW w:w="1185" w:type="dxa"/>
             <w:tcBorders/>
           </w:tcPr>
           <w:p>
@@ -21687,7 +21687,7 @@
         </w:tc>
         <w:tc>
           <w:tcPr>
-            <w:tcW w:w="880" w:type="dxa"/>
+            <w:tcW w:w="675" w:type="dxa"/>
             <w:tcBorders/>
           </w:tcPr>
           <w:p>
@@ -21718,7 +21718,7 @@
         </w:tc>
         <w:tc>
           <w:tcPr>
-            <w:tcW w:w="880" w:type="dxa"/>
+            <w:tcW w:w="2100" w:type="dxa"/>
             <w:tcBorders/>
           </w:tcPr>
           <w:p>
@@ -21749,7 +21749,7 @@
         </w:tc>
         <w:tc>
           <w:tcPr>
-            <w:tcW w:w="881" w:type="dxa"/>
+            <w:tcW w:w="2160" w:type="dxa"/>
             <w:tcBorders/>
           </w:tcPr>
           <w:p>
@@ -21780,7 +21780,7 @@
         </w:tc>
         <w:tc>
           <w:tcPr>
-            <w:tcW w:w="880" w:type="dxa"/>
+            <w:tcW w:w="1080" w:type="dxa"/>
             <w:tcBorders/>
           </w:tcPr>
           <w:p>
@@ -21811,7 +21811,7 @@
         </w:tc>
         <w:tc>
           <w:tcPr>
-            <w:tcW w:w="880" w:type="dxa"/>
+            <w:tcW w:w="960" w:type="dxa"/>
             <w:tcBorders/>
           </w:tcPr>
           <w:p>
@@ -21842,7 +21842,7 @@
         </w:tc>
         <w:tc>
           <w:tcPr>
-            <w:tcW w:w="880" w:type="dxa"/>
+            <w:tcW w:w="1755" w:type="dxa"/>
             <w:tcBorders/>
           </w:tcPr>
           <w:p>
@@ -21873,7 +21873,7 @@
         </w:tc>
         <w:tc>
           <w:tcPr>
-            <w:tcW w:w="879" w:type="dxa"/>
+            <w:tcW w:w="1590" w:type="dxa"/>
             <w:tcBorders/>
           </w:tcPr>
           <w:p>
@@ -21917,7 +21917,7 @@
         <w:trPr/>
         <w:tc>
           <w:tcPr>
-            <w:tcW w:w="879" w:type="dxa"/>
+            <w:tcW w:w="3060" w:type="dxa"/>
             <w:tcBorders/>
           </w:tcPr>
           <w:p>
@@ -21948,7 +21948,7 @@
         </w:tc>
         <w:tc>
           <w:tcPr>
-            <w:tcW w:w="880" w:type="dxa"/>
+            <w:tcW w:w="1185" w:type="dxa"/>
             <w:tcBorders/>
           </w:tcPr>
           <w:p>
@@ -21979,7 +21979,7 @@
         </w:tc>
         <w:tc>
           <w:tcPr>
-            <w:tcW w:w="880" w:type="dxa"/>
+            <w:tcW w:w="675" w:type="dxa"/>
             <w:tcBorders/>
           </w:tcPr>
           <w:p>
@@ -22010,7 +22010,7 @@
         </w:tc>
         <w:tc>
           <w:tcPr>
-            <w:tcW w:w="880" w:type="dxa"/>
+            <w:tcW w:w="2100" w:type="dxa"/>
             <w:tcBorders/>
           </w:tcPr>
           <w:p>
@@ -22053,7 +22053,7 @@
         </w:tc>
         <w:tc>
           <w:tcPr>
-            <w:tcW w:w="881" w:type="dxa"/>
+            <w:tcW w:w="2160" w:type="dxa"/>
             <w:tcBorders/>
           </w:tcPr>
           <w:p>
@@ -22084,7 +22084,7 @@
         </w:tc>
         <w:tc>
           <w:tcPr>
-            <w:tcW w:w="880" w:type="dxa"/>
+            <w:tcW w:w="1080" w:type="dxa"/>
             <w:tcBorders/>
           </w:tcPr>
           <w:p>
@@ -22115,7 +22115,7 @@
         </w:tc>
         <w:tc>
           <w:tcPr>
-            <w:tcW w:w="880" w:type="dxa"/>
+            <w:tcW w:w="960" w:type="dxa"/>
             <w:tcBorders/>
           </w:tcPr>
           <w:p>
@@ -22146,7 +22146,7 @@
         </w:tc>
         <w:tc>
           <w:tcPr>
-            <w:tcW w:w="880" w:type="dxa"/>
+            <w:tcW w:w="1755" w:type="dxa"/>
             <w:tcBorders/>
           </w:tcPr>
           <w:p>
@@ -22177,7 +22177,7 @@
         </w:tc>
         <w:tc>
           <w:tcPr>
-            <w:tcW w:w="879" w:type="dxa"/>
+            <w:tcW w:w="1590" w:type="dxa"/>
             <w:tcBorders/>
           </w:tcPr>
           <w:p>
@@ -22221,7 +22221,7 @@
         <w:trPr/>
         <w:tc>
           <w:tcPr>
-            <w:tcW w:w="879" w:type="dxa"/>
+            <w:tcW w:w="3060" w:type="dxa"/>
             <w:tcBorders/>
           </w:tcPr>
           <w:p>
@@ -22252,7 +22252,7 @@
         </w:tc>
         <w:tc>
           <w:tcPr>
-            <w:tcW w:w="880" w:type="dxa"/>
+            <w:tcW w:w="1185" w:type="dxa"/>
             <w:tcBorders/>
           </w:tcPr>
           <w:p>
@@ -22283,7 +22283,7 @@
         </w:tc>
         <w:tc>
           <w:tcPr>
-            <w:tcW w:w="880" w:type="dxa"/>
+            <w:tcW w:w="675" w:type="dxa"/>
             <w:tcBorders/>
           </w:tcPr>
           <w:p>
@@ -22314,7 +22314,7 @@
         </w:tc>
         <w:tc>
           <w:tcPr>
-            <w:tcW w:w="880" w:type="dxa"/>
+            <w:tcW w:w="2100" w:type="dxa"/>
             <w:tcBorders/>
           </w:tcPr>
           <w:p>
@@ -22345,7 +22345,7 @@
         </w:tc>
         <w:tc>
           <w:tcPr>
-            <w:tcW w:w="881" w:type="dxa"/>
+            <w:tcW w:w="2160" w:type="dxa"/>
             <w:tcBorders/>
           </w:tcPr>
           <w:p>
@@ -22388,7 +22388,7 @@
         </w:tc>
         <w:tc>
           <w:tcPr>
-            <w:tcW w:w="880" w:type="dxa"/>
+            <w:tcW w:w="1080" w:type="dxa"/>
             <w:tcBorders/>
           </w:tcPr>
           <w:p>
@@ -22419,7 +22419,7 @@
         </w:tc>
         <w:tc>
           <w:tcPr>
-            <w:tcW w:w="880" w:type="dxa"/>
+            <w:tcW w:w="960" w:type="dxa"/>
             <w:tcBorders/>
           </w:tcPr>
           <w:p>
@@ -22450,7 +22450,7 @@
         </w:tc>
         <w:tc>
           <w:tcPr>
-            <w:tcW w:w="880" w:type="dxa"/>
+            <w:tcW w:w="1755" w:type="dxa"/>
             <w:tcBorders/>
           </w:tcPr>
           <w:p>
@@ -22481,7 +22481,7 @@
         </w:tc>
         <w:tc>
           <w:tcPr>
-            <w:tcW w:w="879" w:type="dxa"/>
+            <w:tcW w:w="1590" w:type="dxa"/>
             <w:tcBorders/>
           </w:tcPr>
           <w:p>
@@ -22525,7 +22525,7 @@
         <w:trPr/>
         <w:tc>
           <w:tcPr>
-            <w:tcW w:w="879" w:type="dxa"/>
+            <w:tcW w:w="3060" w:type="dxa"/>
             <w:tcBorders/>
           </w:tcPr>
           <w:p>
@@ -22556,7 +22556,7 @@
         </w:tc>
         <w:tc>
           <w:tcPr>
-            <w:tcW w:w="880" w:type="dxa"/>
+            <w:tcW w:w="1185" w:type="dxa"/>
             <w:tcBorders/>
           </w:tcPr>
           <w:p>
@@ -22587,7 +22587,7 @@
         </w:tc>
         <w:tc>
           <w:tcPr>
-            <w:tcW w:w="880" w:type="dxa"/>
+            <w:tcW w:w="675" w:type="dxa"/>
             <w:tcBorders/>
           </w:tcPr>
           <w:p>
@@ -22618,7 +22618,7 @@
         </w:tc>
         <w:tc>
           <w:tcPr>
-            <w:tcW w:w="880" w:type="dxa"/>
+            <w:tcW w:w="2100" w:type="dxa"/>
             <w:tcBorders/>
           </w:tcPr>
           <w:p>
@@ -22649,7 +22649,7 @@
         </w:tc>
         <w:tc>
           <w:tcPr>
-            <w:tcW w:w="881" w:type="dxa"/>
+            <w:tcW w:w="2160" w:type="dxa"/>
             <w:tcBorders/>
           </w:tcPr>
           <w:p>
@@ -22692,7 +22692,7 @@
         </w:tc>
         <w:tc>
           <w:tcPr>
-            <w:tcW w:w="880" w:type="dxa"/>
+            <w:tcW w:w="1080" w:type="dxa"/>
             <w:tcBorders/>
           </w:tcPr>
           <w:p>
@@ -22723,7 +22723,7 @@
         </w:tc>
         <w:tc>
           <w:tcPr>
-            <w:tcW w:w="880" w:type="dxa"/>
+            <w:tcW w:w="960" w:type="dxa"/>
             <w:tcBorders/>
           </w:tcPr>
           <w:p>
@@ -22754,7 +22754,7 @@
         </w:tc>
         <w:tc>
           <w:tcPr>
-            <w:tcW w:w="880" w:type="dxa"/>
+            <w:tcW w:w="1755" w:type="dxa"/>
             <w:tcBorders/>
           </w:tcPr>
           <w:p>
@@ -22785,7 +22785,7 @@
         </w:tc>
         <w:tc>
           <w:tcPr>
-            <w:tcW w:w="879" w:type="dxa"/>
+            <w:tcW w:w="1590" w:type="dxa"/>
             <w:tcBorders/>
           </w:tcPr>
           <w:p>
@@ -22829,7 +22829,7 @@
         <w:trPr/>
         <w:tc>
           <w:tcPr>
-            <w:tcW w:w="879" w:type="dxa"/>
+            <w:tcW w:w="3060" w:type="dxa"/>
             <w:tcBorders/>
           </w:tcPr>
           <w:p>
@@ -22860,7 +22860,7 @@
         </w:tc>
         <w:tc>
           <w:tcPr>
-            <w:tcW w:w="880" w:type="dxa"/>
+            <w:tcW w:w="1185" w:type="dxa"/>
             <w:tcBorders/>
           </w:tcPr>
           <w:p>
@@ -22891,7 +22891,7 @@
         </w:tc>
         <w:tc>
           <w:tcPr>
-            <w:tcW w:w="880" w:type="dxa"/>
+            <w:tcW w:w="675" w:type="dxa"/>
             <w:tcBorders/>
           </w:tcPr>
           <w:p>
@@ -22922,7 +22922,7 @@
         </w:tc>
         <w:tc>
           <w:tcPr>
-            <w:tcW w:w="880" w:type="dxa"/>
+            <w:tcW w:w="2100" w:type="dxa"/>
             <w:tcBorders/>
           </w:tcPr>
           <w:p>
@@ -22965,7 +22965,7 @@
         </w:tc>
         <w:tc>
           <w:tcPr>
-            <w:tcW w:w="881" w:type="dxa"/>
+            <w:tcW w:w="2160" w:type="dxa"/>
             <w:tcBorders/>
           </w:tcPr>
           <w:p>
@@ -22996,7 +22996,7 @@
         </w:tc>
         <w:tc>
           <w:tcPr>
-            <w:tcW w:w="880" w:type="dxa"/>
+            <w:tcW w:w="1080" w:type="dxa"/>
             <w:tcBorders/>
           </w:tcPr>
           <w:p>
@@ -23027,7 +23027,7 @@
         </w:tc>
         <w:tc>
           <w:tcPr>
-            <w:tcW w:w="880" w:type="dxa"/>
+            <w:tcW w:w="960" w:type="dxa"/>
             <w:tcBorders/>
           </w:tcPr>
           <w:p>
@@ -23058,7 +23058,7 @@
         </w:tc>
         <w:tc>
           <w:tcPr>
-            <w:tcW w:w="880" w:type="dxa"/>
+            <w:tcW w:w="1755" w:type="dxa"/>
             <w:tcBorders/>
           </w:tcPr>
           <w:p>
@@ -23089,7 +23089,7 @@
         </w:tc>
         <w:tc>
           <w:tcPr>
-            <w:tcW w:w="879" w:type="dxa"/>
+            <w:tcW w:w="1590" w:type="dxa"/>
             <w:tcBorders/>
           </w:tcPr>
           <w:p>
@@ -23133,7 +23133,7 @@
         <w:trPr/>
         <w:tc>
           <w:tcPr>
-            <w:tcW w:w="879" w:type="dxa"/>
+            <w:tcW w:w="3060" w:type="dxa"/>
             <w:tcBorders/>
           </w:tcPr>
           <w:p>
@@ -23164,7 +23164,7 @@
         </w:tc>
         <w:tc>
           <w:tcPr>
-            <w:tcW w:w="880" w:type="dxa"/>
+            <w:tcW w:w="1185" w:type="dxa"/>
             <w:tcBorders/>
           </w:tcPr>
           <w:p>
@@ -23195,7 +23195,7 @@
         </w:tc>
         <w:tc>
           <w:tcPr>
-            <w:tcW w:w="880" w:type="dxa"/>
+            <w:tcW w:w="675" w:type="dxa"/>
             <w:tcBorders/>
           </w:tcPr>
           <w:p>
@@ -23226,7 +23226,7 @@
         </w:tc>
         <w:tc>
           <w:tcPr>
-            <w:tcW w:w="880" w:type="dxa"/>
+            <w:tcW w:w="2100" w:type="dxa"/>
             <w:tcBorders/>
           </w:tcPr>
           <w:p>
@@ -23269,7 +23269,7 @@
         </w:tc>
         <w:tc>
           <w:tcPr>
-            <w:tcW w:w="881" w:type="dxa"/>
+            <w:tcW w:w="2160" w:type="dxa"/>
             <w:tcBorders/>
           </w:tcPr>
           <w:p>
@@ -23300,7 +23300,7 @@
         </w:tc>
         <w:tc>
           <w:tcPr>
-            <w:tcW w:w="880" w:type="dxa"/>
+            <w:tcW w:w="1080" w:type="dxa"/>
             <w:tcBorders/>
           </w:tcPr>
           <w:p>
@@ -23331,7 +23331,7 @@
         </w:tc>
         <w:tc>
           <w:tcPr>
-            <w:tcW w:w="880" w:type="dxa"/>
+            <w:tcW w:w="960" w:type="dxa"/>
             <w:tcBorders/>
           </w:tcPr>
           <w:p>
@@ -23362,7 +23362,7 @@
         </w:tc>
         <w:tc>
           <w:tcPr>
-            <w:tcW w:w="880" w:type="dxa"/>
+            <w:tcW w:w="1755" w:type="dxa"/>
             <w:tcBorders/>
           </w:tcPr>
           <w:p>
@@ -23393,7 +23393,7 @@
         </w:tc>
         <w:tc>
           <w:tcPr>
-            <w:tcW w:w="879" w:type="dxa"/>
+            <w:tcW w:w="1590" w:type="dxa"/>
             <w:tcBorders/>
           </w:tcPr>
           <w:p>
@@ -23427,7 +23427,7 @@
         <w:trPr/>
         <w:tc>
           <w:tcPr>
-            <w:tcW w:w="879" w:type="dxa"/>
+            <w:tcW w:w="3060" w:type="dxa"/>
             <w:tcBorders/>
           </w:tcPr>
           <w:p>
@@ -23458,7 +23458,7 @@
         </w:tc>
         <w:tc>
           <w:tcPr>
-            <w:tcW w:w="880" w:type="dxa"/>
+            <w:tcW w:w="1185" w:type="dxa"/>
             <w:tcBorders/>
           </w:tcPr>
           <w:p>
@@ -23489,7 +23489,7 @@
         </w:tc>
         <w:tc>
           <w:tcPr>
-            <w:tcW w:w="880" w:type="dxa"/>
+            <w:tcW w:w="675" w:type="dxa"/>
             <w:tcBorders/>
           </w:tcPr>
           <w:p>
@@ -23520,7 +23520,7 @@
         </w:tc>
         <w:tc>
           <w:tcPr>
-            <w:tcW w:w="880" w:type="dxa"/>
+            <w:tcW w:w="2100" w:type="dxa"/>
             <w:tcBorders/>
           </w:tcPr>
           <w:p>
@@ -23551,7 +23551,7 @@
         </w:tc>
         <w:tc>
           <w:tcPr>
-            <w:tcW w:w="881" w:type="dxa"/>
+            <w:tcW w:w="2160" w:type="dxa"/>
             <w:tcBorders/>
           </w:tcPr>
           <w:p>
@@ -23594,7 +23594,7 @@
         </w:tc>
         <w:tc>
           <w:tcPr>
-            <w:tcW w:w="880" w:type="dxa"/>
+            <w:tcW w:w="1080" w:type="dxa"/>
             <w:tcBorders/>
           </w:tcPr>
           <w:p>
@@ -23625,7 +23625,7 @@
         </w:tc>
         <w:tc>
           <w:tcPr>
-            <w:tcW w:w="880" w:type="dxa"/>
+            <w:tcW w:w="960" w:type="dxa"/>
             <w:tcBorders/>
           </w:tcPr>
           <w:p>
@@ -23656,7 +23656,7 @@
         </w:tc>
         <w:tc>
           <w:tcPr>
-            <w:tcW w:w="880" w:type="dxa"/>
+            <w:tcW w:w="1755" w:type="dxa"/>
             <w:tcBorders/>
           </w:tcPr>
           <w:p>
@@ -23687,7 +23687,7 @@
         </w:tc>
         <w:tc>
           <w:tcPr>
-            <w:tcW w:w="879" w:type="dxa"/>
+            <w:tcW w:w="1590" w:type="dxa"/>
             <w:tcBorders/>
           </w:tcPr>
           <w:p>
@@ -23731,7 +23731,7 @@
         <w:trPr/>
         <w:tc>
           <w:tcPr>
-            <w:tcW w:w="879" w:type="dxa"/>
+            <w:tcW w:w="3060" w:type="dxa"/>
             <w:tcBorders/>
           </w:tcPr>
           <w:p>
@@ -23762,7 +23762,7 @@
         </w:tc>
         <w:tc>
           <w:tcPr>
-            <w:tcW w:w="880" w:type="dxa"/>
+            <w:tcW w:w="1185" w:type="dxa"/>
             <w:tcBorders/>
           </w:tcPr>
           <w:p>
@@ -23793,7 +23793,7 @@
         </w:tc>
         <w:tc>
           <w:tcPr>
-            <w:tcW w:w="880" w:type="dxa"/>
+            <w:tcW w:w="675" w:type="dxa"/>
             <w:tcBorders/>
           </w:tcPr>
           <w:p>
@@ -23824,7 +23824,7 @@
         </w:tc>
         <w:tc>
           <w:tcPr>
-            <w:tcW w:w="880" w:type="dxa"/>
+            <w:tcW w:w="2100" w:type="dxa"/>
             <w:tcBorders/>
           </w:tcPr>
           <w:p>
@@ -23855,7 +23855,7 @@
         </w:tc>
         <w:tc>
           <w:tcPr>
-            <w:tcW w:w="881" w:type="dxa"/>
+            <w:tcW w:w="2160" w:type="dxa"/>
             <w:tcBorders/>
           </w:tcPr>
           <w:p>
@@ -23886,7 +23886,7 @@
         </w:tc>
         <w:tc>
           <w:tcPr>
-            <w:tcW w:w="880" w:type="dxa"/>
+            <w:tcW w:w="1080" w:type="dxa"/>
             <w:tcBorders/>
           </w:tcPr>
           <w:p>
@@ -23917,7 +23917,7 @@
         </w:tc>
         <w:tc>
           <w:tcPr>
-            <w:tcW w:w="880" w:type="dxa"/>
+            <w:tcW w:w="960" w:type="dxa"/>
             <w:tcBorders/>
           </w:tcPr>
           <w:p>
@@ -23948,7 +23948,7 @@
         </w:tc>
         <w:tc>
           <w:tcPr>
-            <w:tcW w:w="880" w:type="dxa"/>
+            <w:tcW w:w="1755" w:type="dxa"/>
             <w:tcBorders/>
           </w:tcPr>
           <w:p>
@@ -23979,7 +23979,7 @@
         </w:tc>
         <w:tc>
           <w:tcPr>
-            <w:tcW w:w="879" w:type="dxa"/>
+            <w:tcW w:w="1590" w:type="dxa"/>
             <w:tcBorders/>
           </w:tcPr>
           <w:p>
@@ -24023,7 +24023,7 @@
         <w:trPr/>
         <w:tc>
           <w:tcPr>
-            <w:tcW w:w="879" w:type="dxa"/>
+            <w:tcW w:w="3060" w:type="dxa"/>
             <w:tcBorders/>
           </w:tcPr>
           <w:p>
@@ -24054,7 +24054,7 @@
         </w:tc>
         <w:tc>
           <w:tcPr>
-            <w:tcW w:w="880" w:type="dxa"/>
+            <w:tcW w:w="1185" w:type="dxa"/>
             <w:tcBorders/>
           </w:tcPr>
           <w:p>
@@ -24085,7 +24085,7 @@
         </w:tc>
         <w:tc>
           <w:tcPr>
-            <w:tcW w:w="880" w:type="dxa"/>
+            <w:tcW w:w="675" w:type="dxa"/>
             <w:tcBorders/>
           </w:tcPr>
           <w:p>
@@ -24116,7 +24116,7 @@
         </w:tc>
         <w:tc>
           <w:tcPr>
-            <w:tcW w:w="880" w:type="dxa"/>
+            <w:tcW w:w="2100" w:type="dxa"/>
             <w:tcBorders/>
           </w:tcPr>
           <w:p>
@@ -24159,7 +24159,7 @@
         </w:tc>
         <w:tc>
           <w:tcPr>
-            <w:tcW w:w="881" w:type="dxa"/>
+            <w:tcW w:w="2160" w:type="dxa"/>
             <w:tcBorders/>
           </w:tcPr>
           <w:p>
@@ -24190,7 +24190,7 @@
         </w:tc>
         <w:tc>
           <w:tcPr>
-            <w:tcW w:w="880" w:type="dxa"/>
+            <w:tcW w:w="1080" w:type="dxa"/>
             <w:tcBorders/>
           </w:tcPr>
           <w:p>
@@ -24221,7 +24221,7 @@
         </w:tc>
         <w:tc>
           <w:tcPr>
-            <w:tcW w:w="880" w:type="dxa"/>
+            <w:tcW w:w="960" w:type="dxa"/>
             <w:tcBorders/>
           </w:tcPr>
           <w:p>
@@ -24252,7 +24252,7 @@
         </w:tc>
         <w:tc>
           <w:tcPr>
-            <w:tcW w:w="880" w:type="dxa"/>
+            <w:tcW w:w="1755" w:type="dxa"/>
             <w:tcBorders/>
           </w:tcPr>
           <w:p>
@@ -24283,7 +24283,7 @@
         </w:tc>
         <w:tc>
           <w:tcPr>
-            <w:tcW w:w="879" w:type="dxa"/>
+            <w:tcW w:w="1590" w:type="dxa"/>
             <w:tcBorders/>
           </w:tcPr>
           <w:p>
@@ -24327,7 +24327,7 @@
         <w:trPr/>
         <w:tc>
           <w:tcPr>
-            <w:tcW w:w="879" w:type="dxa"/>
+            <w:tcW w:w="3060" w:type="dxa"/>
             <w:tcBorders/>
           </w:tcPr>
           <w:p>
@@ -24358,7 +24358,7 @@
         </w:tc>
         <w:tc>
           <w:tcPr>
-            <w:tcW w:w="880" w:type="dxa"/>
+            <w:tcW w:w="1185" w:type="dxa"/>
             <w:tcBorders/>
           </w:tcPr>
           <w:p>
@@ -24389,7 +24389,7 @@
         </w:tc>
         <w:tc>
           <w:tcPr>
-            <w:tcW w:w="880" w:type="dxa"/>
+            <w:tcW w:w="675" w:type="dxa"/>
             <w:tcBorders/>
           </w:tcPr>
           <w:p>
@@ -24420,7 +24420,7 @@
         </w:tc>
         <w:tc>
           <w:tcPr>
-            <w:tcW w:w="880" w:type="dxa"/>
+            <w:tcW w:w="2100" w:type="dxa"/>
             <w:tcBorders/>
           </w:tcPr>
           <w:p>
@@ -24463,7 +24463,7 @@
         </w:tc>
         <w:tc>
           <w:tcPr>
-            <w:tcW w:w="881" w:type="dxa"/>
+            <w:tcW w:w="2160" w:type="dxa"/>
             <w:tcBorders/>
           </w:tcPr>
           <w:p>
@@ -24494,7 +24494,7 @@
         </w:tc>
         <w:tc>
           <w:tcPr>
-            <w:tcW w:w="880" w:type="dxa"/>
+            <w:tcW w:w="1080" w:type="dxa"/>
             <w:tcBorders/>
           </w:tcPr>
           <w:p>
@@ -24525,7 +24525,7 @@
         </w:tc>
         <w:tc>
           <w:tcPr>
-            <w:tcW w:w="880" w:type="dxa"/>
+            <w:tcW w:w="960" w:type="dxa"/>
             <w:tcBorders/>
           </w:tcPr>
           <w:p>
@@ -24556,7 +24556,7 @@
         </w:tc>
         <w:tc>
           <w:tcPr>
-            <w:tcW w:w="880" w:type="dxa"/>
+            <w:tcW w:w="1755" w:type="dxa"/>
             <w:tcBorders/>
           </w:tcPr>
           <w:p>
@@ -24587,7 +24587,7 @@
         </w:tc>
         <w:tc>
           <w:tcPr>
-            <w:tcW w:w="879" w:type="dxa"/>
+            <w:tcW w:w="1590" w:type="dxa"/>
             <w:tcBorders/>
           </w:tcPr>
           <w:p>
@@ -24631,7 +24631,7 @@
         <w:trPr/>
         <w:tc>
           <w:tcPr>
-            <w:tcW w:w="879" w:type="dxa"/>
+            <w:tcW w:w="3060" w:type="dxa"/>
             <w:tcBorders/>
           </w:tcPr>
           <w:p>
@@ -24662,7 +24662,7 @@
         </w:tc>
         <w:tc>
           <w:tcPr>
-            <w:tcW w:w="880" w:type="dxa"/>
+            <w:tcW w:w="1185" w:type="dxa"/>
             <w:tcBorders/>
           </w:tcPr>
           <w:p>
@@ -24693,7 +24693,7 @@
         </w:tc>
         <w:tc>
           <w:tcPr>
-            <w:tcW w:w="880" w:type="dxa"/>
+            <w:tcW w:w="675" w:type="dxa"/>
             <w:tcBorders/>
           </w:tcPr>
           <w:p>
@@ -24724,7 +24724,7 @@
         </w:tc>
         <w:tc>
           <w:tcPr>
-            <w:tcW w:w="880" w:type="dxa"/>
+            <w:tcW w:w="2100" w:type="dxa"/>
             <w:tcBorders/>
           </w:tcPr>
           <w:p>
@@ -24755,7 +24755,7 @@
         </w:tc>
         <w:tc>
           <w:tcPr>
-            <w:tcW w:w="881" w:type="dxa"/>
+            <w:tcW w:w="2160" w:type="dxa"/>
             <w:tcBorders/>
           </w:tcPr>
           <w:p>
@@ -24798,7 +24798,7 @@
         </w:tc>
         <w:tc>
           <w:tcPr>
-            <w:tcW w:w="880" w:type="dxa"/>
+            <w:tcW w:w="1080" w:type="dxa"/>
             <w:tcBorders/>
           </w:tcPr>
           <w:p>
@@ -24829,7 +24829,7 @@
         </w:tc>
         <w:tc>
           <w:tcPr>
-            <w:tcW w:w="880" w:type="dxa"/>
+            <w:tcW w:w="960" w:type="dxa"/>
             <w:tcBorders/>
           </w:tcPr>
           <w:p>
@@ -24860,7 +24860,7 @@
         </w:tc>
         <w:tc>
           <w:tcPr>
-            <w:tcW w:w="880" w:type="dxa"/>
+            <w:tcW w:w="1755" w:type="dxa"/>
             <w:tcBorders/>
           </w:tcPr>
           <w:p>
@@ -24891,7 +24891,7 @@
         </w:tc>
         <w:tc>
           <w:tcPr>
-            <w:tcW w:w="879" w:type="dxa"/>
+            <w:tcW w:w="1590" w:type="dxa"/>
             <w:tcBorders/>
           </w:tcPr>
           <w:p>
@@ -24935,7 +24935,7 @@
         <w:trPr/>
         <w:tc>
           <w:tcPr>
-            <w:tcW w:w="879" w:type="dxa"/>
+            <w:tcW w:w="3060" w:type="dxa"/>
             <w:tcBorders/>
           </w:tcPr>
           <w:p>
@@ -24966,7 +24966,7 @@
         </w:tc>
         <w:tc>
           <w:tcPr>
-            <w:tcW w:w="880" w:type="dxa"/>
+            <w:tcW w:w="1185" w:type="dxa"/>
             <w:tcBorders/>
           </w:tcPr>
           <w:p>
@@ -24997,7 +24997,7 @@
         </w:tc>
         <w:tc>
           <w:tcPr>
-            <w:tcW w:w="880" w:type="dxa"/>
+            <w:tcW w:w="675" w:type="dxa"/>
             <w:tcBorders/>
           </w:tcPr>
           <w:p>
@@ -25028,7 +25028,7 @@
         </w:tc>
         <w:tc>
           <w:tcPr>
-            <w:tcW w:w="880" w:type="dxa"/>
+            <w:tcW w:w="2100" w:type="dxa"/>
             <w:tcBorders/>
           </w:tcPr>
           <w:p>
@@ -25071,7 +25071,7 @@
         </w:tc>
         <w:tc>
           <w:tcPr>
-            <w:tcW w:w="881" w:type="dxa"/>
+            <w:tcW w:w="2160" w:type="dxa"/>
             <w:tcBorders/>
           </w:tcPr>
           <w:p>
@@ -25102,7 +25102,7 @@
         </w:tc>
         <w:tc>
           <w:tcPr>
-            <w:tcW w:w="880" w:type="dxa"/>
+            <w:tcW w:w="1080" w:type="dxa"/>
             <w:tcBorders/>
           </w:tcPr>
           <w:p>
@@ -25133,7 +25133,7 @@
         </w:tc>
         <w:tc>
           <w:tcPr>
-            <w:tcW w:w="880" w:type="dxa"/>
+            <w:tcW w:w="960" w:type="dxa"/>
             <w:tcBorders/>
           </w:tcPr>
           <w:p>
@@ -25164,7 +25164,7 @@
         </w:tc>
         <w:tc>
           <w:tcPr>
-            <w:tcW w:w="880" w:type="dxa"/>
+            <w:tcW w:w="1755" w:type="dxa"/>
             <w:tcBorders/>
           </w:tcPr>
           <w:p>
@@ -25195,7 +25195,7 @@
         </w:tc>
         <w:tc>
           <w:tcPr>
-            <w:tcW w:w="879" w:type="dxa"/>
+            <w:tcW w:w="1590" w:type="dxa"/>
             <w:tcBorders/>
           </w:tcPr>
           <w:p>
@@ -25239,7 +25239,7 @@
         <w:trPr/>
         <w:tc>
           <w:tcPr>
-            <w:tcW w:w="879" w:type="dxa"/>
+            <w:tcW w:w="3060" w:type="dxa"/>
             <w:tcBorders/>
           </w:tcPr>
           <w:p>
@@ -25270,7 +25270,7 @@
         </w:tc>
         <w:tc>
           <w:tcPr>
-            <w:tcW w:w="880" w:type="dxa"/>
+            <w:tcW w:w="1185" w:type="dxa"/>
             <w:tcBorders/>
           </w:tcPr>
           <w:p>
@@ -25301,7 +25301,7 @@
         </w:tc>
         <w:tc>
           <w:tcPr>
-            <w:tcW w:w="880" w:type="dxa"/>
+            <w:tcW w:w="675" w:type="dxa"/>
             <w:tcBorders/>
           </w:tcPr>
           <w:p>
@@ -25332,7 +25332,7 @@
         </w:tc>
         <w:tc>
           <w:tcPr>
-            <w:tcW w:w="880" w:type="dxa"/>
+            <w:tcW w:w="2100" w:type="dxa"/>
             <w:tcBorders/>
           </w:tcPr>
           <w:p>
@@ -25363,7 +25363,7 @@
         </w:tc>
         <w:tc>
           <w:tcPr>
-            <w:tcW w:w="881" w:type="dxa"/>
+            <w:tcW w:w="2160" w:type="dxa"/>
             <w:tcBorders/>
           </w:tcPr>
           <w:p>
@@ -25394,7 +25394,7 @@
         </w:tc>
         <w:tc>
           <w:tcPr>
-            <w:tcW w:w="880" w:type="dxa"/>
+            <w:tcW w:w="1080" w:type="dxa"/>
             <w:tcBorders/>
           </w:tcPr>
           <w:p>
@@ -25425,7 +25425,7 @@
         </w:tc>
         <w:tc>
           <w:tcPr>
-            <w:tcW w:w="880" w:type="dxa"/>
+            <w:tcW w:w="960" w:type="dxa"/>
             <w:tcBorders/>
           </w:tcPr>
           <w:p>
@@ -25456,7 +25456,7 @@
         </w:tc>
         <w:tc>
           <w:tcPr>
-            <w:tcW w:w="880" w:type="dxa"/>
+            <w:tcW w:w="1755" w:type="dxa"/>
             <w:tcBorders/>
           </w:tcPr>
           <w:p>
@@ -25487,7 +25487,7 @@
         </w:tc>
         <w:tc>
           <w:tcPr>
-            <w:tcW w:w="879" w:type="dxa"/>
+            <w:tcW w:w="1590" w:type="dxa"/>
             <w:tcBorders/>
           </w:tcPr>
           <w:p>
@@ -26186,8 +26186,8 @@
         <w:tblLook w:val="0020" w:noHBand="0" w:noVBand="0" w:firstColumn="0" w:lastRow="0" w:lastColumn="0" w:firstRow="1"/>
       </w:tblPr>
       <w:tblGrid>
-        <w:gridCol w:w="2640"/>
-        <w:gridCol w:w="2640"/>
+        <w:gridCol w:w="4125"/>
+        <w:gridCol w:w="1155"/>
         <w:gridCol w:w="2640"/>
       </w:tblGrid>
       <w:tr>
@@ -26196,6 +26196,74 @@
         </w:trPr>
         <w:tc>
           <w:tcPr>
+            <w:tcW w:w="4125" w:type="dxa"/>
+            <w:tcBorders>
+              <w:bottom w:val="single" w:sz="6" w:space="0" w:color="000000"/>
+            </w:tcBorders>
+            <w:vAlign w:val="bottom"/>
+          </w:tcPr>
+          <w:p>
+            <w:pPr>
+              <w:pStyle w:val="Compact"/>
+              <w:widowControl/>
+              <w:spacing w:before="36" w:after="36"/>
+              <w:jc w:val="left"/>
+              <w:rPr>
+                <w:rFonts w:ascii="Cambria" w:hAnsi="Cambria" w:eastAsia="Cambria" w:cs=""/>
+                <w:kern w:val="0"/>
+                <w:sz w:val="24"/>
+                <w:szCs w:val="24"/>
+                <w:lang w:val="en-US" w:eastAsia="en-US" w:bidi="ar-SA"/>
+              </w:rPr>
+            </w:pPr>
+            <w:r>
+              <w:rPr>
+                <w:rFonts w:eastAsia="Cambria" w:cs=""/>
+                <w:kern w:val="0"/>
+                <w:sz w:val="24"/>
+                <w:szCs w:val="24"/>
+                <w:lang w:val="en-US" w:eastAsia="en-US" w:bidi="ar-SA"/>
+              </w:rPr>
+              <w:t>Категория</w:t>
+            </w:r>
+          </w:p>
+        </w:tc>
+        <w:tc>
+          <w:tcPr>
+            <w:tcW w:w="1155" w:type="dxa"/>
+            <w:tcBorders>
+              <w:bottom w:val="single" w:sz="6" w:space="0" w:color="000000"/>
+            </w:tcBorders>
+            <w:vAlign w:val="bottom"/>
+          </w:tcPr>
+          <w:p>
+            <w:pPr>
+              <w:pStyle w:val="Compact"/>
+              <w:widowControl/>
+              <w:spacing w:before="36" w:after="36"/>
+              <w:jc w:val="right"/>
+              <w:rPr>
+                <w:rFonts w:ascii="Cambria" w:hAnsi="Cambria" w:eastAsia="Cambria" w:cs=""/>
+                <w:kern w:val="0"/>
+                <w:sz w:val="24"/>
+                <w:szCs w:val="24"/>
+                <w:lang w:val="en-US" w:eastAsia="en-US" w:bidi="ar-SA"/>
+              </w:rPr>
+            </w:pPr>
+            <w:r>
+              <w:rPr>
+                <w:rFonts w:eastAsia="Cambria" w:cs=""/>
+                <w:kern w:val="0"/>
+                <w:sz w:val="24"/>
+                <w:szCs w:val="24"/>
+                <w:lang w:val="en-US" w:eastAsia="en-US" w:bidi="ar-SA"/>
+              </w:rPr>
+              <w:t>Кол-во</w:t>
+            </w:r>
+          </w:p>
+        </w:tc>
+        <w:tc>
+          <w:tcPr>
             <w:tcW w:w="2640" w:type="dxa"/>
             <w:tcBorders>
               <w:bottom w:val="single" w:sz="6" w:space="0" w:color="000000"/>
@@ -26207,74 +26275,6 @@
               <w:pStyle w:val="Compact"/>
               <w:widowControl/>
               <w:spacing w:before="36" w:after="36"/>
-              <w:jc w:val="left"/>
-              <w:rPr>
-                <w:rFonts w:ascii="Cambria" w:hAnsi="Cambria" w:eastAsia="Cambria" w:cs=""/>
-                <w:kern w:val="0"/>
-                <w:sz w:val="24"/>
-                <w:szCs w:val="24"/>
-                <w:lang w:val="en-US" w:eastAsia="en-US" w:bidi="ar-SA"/>
-              </w:rPr>
-            </w:pPr>
-            <w:r>
-              <w:rPr>
-                <w:rFonts w:eastAsia="Cambria" w:cs=""/>
-                <w:kern w:val="0"/>
-                <w:sz w:val="24"/>
-                <w:szCs w:val="24"/>
-                <w:lang w:val="en-US" w:eastAsia="en-US" w:bidi="ar-SA"/>
-              </w:rPr>
-              <w:t>Категория</w:t>
-            </w:r>
-          </w:p>
-        </w:tc>
-        <w:tc>
-          <w:tcPr>
-            <w:tcW w:w="2640" w:type="dxa"/>
-            <w:tcBorders>
-              <w:bottom w:val="single" w:sz="6" w:space="0" w:color="000000"/>
-            </w:tcBorders>
-            <w:vAlign w:val="bottom"/>
-          </w:tcPr>
-          <w:p>
-            <w:pPr>
-              <w:pStyle w:val="Compact"/>
-              <w:widowControl/>
-              <w:spacing w:before="36" w:after="36"/>
-              <w:jc w:val="right"/>
-              <w:rPr>
-                <w:rFonts w:ascii="Cambria" w:hAnsi="Cambria" w:eastAsia="Cambria" w:cs=""/>
-                <w:kern w:val="0"/>
-                <w:sz w:val="24"/>
-                <w:szCs w:val="24"/>
-                <w:lang w:val="en-US" w:eastAsia="en-US" w:bidi="ar-SA"/>
-              </w:rPr>
-            </w:pPr>
-            <w:r>
-              <w:rPr>
-                <w:rFonts w:eastAsia="Cambria" w:cs=""/>
-                <w:kern w:val="0"/>
-                <w:sz w:val="24"/>
-                <w:szCs w:val="24"/>
-                <w:lang w:val="en-US" w:eastAsia="en-US" w:bidi="ar-SA"/>
-              </w:rPr>
-              <w:t>Кол-во</w:t>
-            </w:r>
-          </w:p>
-        </w:tc>
-        <w:tc>
-          <w:tcPr>
-            <w:tcW w:w="2640" w:type="dxa"/>
-            <w:tcBorders>
-              <w:bottom w:val="single" w:sz="6" w:space="0" w:color="000000"/>
-            </w:tcBorders>
-            <w:vAlign w:val="bottom"/>
-          </w:tcPr>
-          <w:p>
-            <w:pPr>
-              <w:pStyle w:val="Compact"/>
-              <w:widowControl/>
-              <w:spacing w:before="36" w:after="36"/>
               <w:jc w:val="right"/>
               <w:rPr>
                 <w:rFonts w:ascii="Cambria" w:hAnsi="Cambria" w:eastAsia="Cambria" w:cs=""/>
@@ -26301,7 +26301,7 @@
         <w:trPr/>
         <w:tc>
           <w:tcPr>
-            <w:tcW w:w="2640" w:type="dxa"/>
+            <w:tcW w:w="4125" w:type="dxa"/>
             <w:tcBorders/>
           </w:tcPr>
           <w:p>
@@ -26332,7 +26332,7 @@
         </w:tc>
         <w:tc>
           <w:tcPr>
-            <w:tcW w:w="2640" w:type="dxa"/>
+            <w:tcW w:w="1155" w:type="dxa"/>
             <w:tcBorders/>
           </w:tcPr>
           <w:p>
@@ -26397,7 +26397,7 @@
         <w:trPr/>
         <w:tc>
           <w:tcPr>
-            <w:tcW w:w="2640" w:type="dxa"/>
+            <w:tcW w:w="4125" w:type="dxa"/>
             <w:tcBorders/>
           </w:tcPr>
           <w:p>
@@ -26428,7 +26428,7 @@
         </w:tc>
         <w:tc>
           <w:tcPr>
-            <w:tcW w:w="2640" w:type="dxa"/>
+            <w:tcW w:w="1155" w:type="dxa"/>
             <w:tcBorders/>
           </w:tcPr>
           <w:p>
@@ -26493,7 +26493,7 @@
         <w:trPr/>
         <w:tc>
           <w:tcPr>
-            <w:tcW w:w="2640" w:type="dxa"/>
+            <w:tcW w:w="4125" w:type="dxa"/>
             <w:tcBorders/>
           </w:tcPr>
           <w:p>
@@ -26524,7 +26524,7 @@
         </w:tc>
         <w:tc>
           <w:tcPr>
-            <w:tcW w:w="2640" w:type="dxa"/>
+            <w:tcW w:w="1155" w:type="dxa"/>
             <w:tcBorders/>
           </w:tcPr>
           <w:p>
@@ -26589,7 +26589,7 @@
         <w:trPr/>
         <w:tc>
           <w:tcPr>
-            <w:tcW w:w="2640" w:type="dxa"/>
+            <w:tcW w:w="4125" w:type="dxa"/>
             <w:tcBorders/>
           </w:tcPr>
           <w:p>
@@ -26620,7 +26620,7 @@
         </w:tc>
         <w:tc>
           <w:tcPr>
-            <w:tcW w:w="2640" w:type="dxa"/>
+            <w:tcW w:w="1155" w:type="dxa"/>
             <w:tcBorders/>
           </w:tcPr>
           <w:p>
@@ -26685,7 +26685,7 @@
         <w:trPr/>
         <w:tc>
           <w:tcPr>
-            <w:tcW w:w="2640" w:type="dxa"/>
+            <w:tcW w:w="4125" w:type="dxa"/>
             <w:tcBorders/>
           </w:tcPr>
           <w:p>
@@ -26716,7 +26716,7 @@
         </w:tc>
         <w:tc>
           <w:tcPr>
-            <w:tcW w:w="2640" w:type="dxa"/>
+            <w:tcW w:w="1155" w:type="dxa"/>
             <w:tcBorders/>
           </w:tcPr>
           <w:p>
@@ -26781,7 +26781,7 @@
         <w:trPr/>
         <w:tc>
           <w:tcPr>
-            <w:tcW w:w="2640" w:type="dxa"/>
+            <w:tcW w:w="4125" w:type="dxa"/>
             <w:tcBorders/>
           </w:tcPr>
           <w:p>
@@ -26812,7 +26812,7 @@
         </w:tc>
         <w:tc>
           <w:tcPr>
-            <w:tcW w:w="2640" w:type="dxa"/>
+            <w:tcW w:w="1155" w:type="dxa"/>
             <w:tcBorders/>
           </w:tcPr>
           <w:p>
@@ -26877,7 +26877,7 @@
         <w:trPr/>
         <w:tc>
           <w:tcPr>
-            <w:tcW w:w="2640" w:type="dxa"/>
+            <w:tcW w:w="4125" w:type="dxa"/>
             <w:tcBorders/>
           </w:tcPr>
           <w:p>
@@ -26910,7 +26910,7 @@
         </w:tc>
         <w:tc>
           <w:tcPr>
-            <w:tcW w:w="2640" w:type="dxa"/>
+            <w:tcW w:w="1155" w:type="dxa"/>
             <w:tcBorders/>
           </w:tcPr>
           <w:p>

</xml_diff>